<commit_message>
modificacion de un documentos
</commit_message>
<xml_diff>
--- a/Fase 2/Evidencias Individuales/Stack_Hanns_2.1_APT122_DiarioReflexionFase2.docx
+++ b/Fase 2/Evidencias Individuales/Stack_Hanns_2.1_APT122_DiarioReflexionFase2.docx
@@ -1,6 +1,6 @@
 
 <file path=word/document.xml><?xml version="1.0" encoding="utf-8"?>
-<w:document xmlns:wpc="http://schemas.microsoft.com/office/word/2010/wordprocessingCanvas" xmlns:cx="http://schemas.microsoft.com/office/drawing/2014/chartex" xmlns:mc="http://schemas.openxmlformats.org/markup-compatibility/2006" xmlns:o="urn:schemas-microsoft-com:office:office" xmlns:r="http://schemas.openxmlformats.org/officeDocument/2006/relationships" xmlns:m="http://schemas.openxmlformats.org/officeDocument/2006/math" xmlns:v="urn:schemas-microsoft-com:vml" xmlns:wp14="http://schemas.microsoft.com/office/word/2010/wordprocessingDrawing" xmlns:wp="http://schemas.openxmlformats.org/drawingml/2006/wordprocessingDrawing" xmlns:w10="urn:schemas-microsoft-com:office:word" xmlns:w="http://schemas.openxmlformats.org/wordprocessingml/2006/main" xmlns:w14="http://schemas.microsoft.com/office/word/2010/wordml" xmlns:w15="http://schemas.microsoft.com/office/word/2012/wordml" xmlns:w16se="http://schemas.microsoft.com/office/word/2015/wordml/symex" xmlns:wpg="http://schemas.microsoft.com/office/word/2010/wordprocessingGroup" xmlns:wpi="http://schemas.microsoft.com/office/word/2010/wordprocessingInk" xmlns:wne="http://schemas.microsoft.com/office/word/2006/wordml" xmlns:wps="http://schemas.microsoft.com/office/word/2010/wordprocessingShape" mc:Ignorable="w14 w15 w16se wp14">
+<w:document xmlns:wpc="http://schemas.microsoft.com/office/word/2010/wordprocessingCanvas" xmlns:cx="http://schemas.microsoft.com/office/drawing/2014/chartex" xmlns:cx1="http://schemas.microsoft.com/office/drawing/2015/9/8/chartex" xmlns:cx2="http://schemas.microsoft.com/office/drawing/2015/10/21/chartex" xmlns:cx3="http://schemas.microsoft.com/office/drawing/2016/5/9/chartex" xmlns:cx4="http://schemas.microsoft.com/office/drawing/2016/5/10/chartex" xmlns:cx5="http://schemas.microsoft.com/office/drawing/2016/5/11/chartex" xmlns:cx6="http://schemas.microsoft.com/office/drawing/2016/5/12/chartex" xmlns:cx7="http://schemas.microsoft.com/office/drawing/2016/5/13/chartex" xmlns:cx8="http://schemas.microsoft.com/office/drawing/2016/5/14/chartex" xmlns:mc="http://schemas.openxmlformats.org/markup-compatibility/2006" xmlns:aink="http://schemas.microsoft.com/office/drawing/2016/ink" xmlns:am3d="http://schemas.microsoft.com/office/drawing/2017/model3d" xmlns:o="urn:schemas-microsoft-com:office:office" xmlns:oel="http://schemas.microsoft.com/office/2019/extlst" xmlns:r="http://schemas.openxmlformats.org/officeDocument/2006/relationships" xmlns:m="http://schemas.openxmlformats.org/officeDocument/2006/math" xmlns:v="urn:schemas-microsoft-com:vml" xmlns:wp14="http://schemas.microsoft.com/office/word/2010/wordprocessingDrawing" xmlns:wp="http://schemas.openxmlformats.org/drawingml/2006/wordprocessingDrawing" xmlns:w10="urn:schemas-microsoft-com:office:word" xmlns:w="http://schemas.openxmlformats.org/wordprocessingml/2006/main" xmlns:w14="http://schemas.microsoft.com/office/word/2010/wordml" xmlns:w15="http://schemas.microsoft.com/office/word/2012/wordml" xmlns:w16cex="http://schemas.microsoft.com/office/word/2018/wordml/cex" xmlns:w16cid="http://schemas.microsoft.com/office/word/2016/wordml/cid" xmlns:w16="http://schemas.microsoft.com/office/word/2018/wordml" xmlns:w16du="http://schemas.microsoft.com/office/word/2023/wordml/word16du" xmlns:w16sdtdh="http://schemas.microsoft.com/office/word/2020/wordml/sdtdatahash" xmlns:w16sdtfl="http://schemas.microsoft.com/office/word/2024/wordml/sdtformatlock" xmlns:w16se="http://schemas.microsoft.com/office/word/2015/wordml/symex" xmlns:wpg="http://schemas.microsoft.com/office/word/2010/wordprocessingGroup" xmlns:wpi="http://schemas.microsoft.com/office/word/2010/wordprocessingInk" xmlns:wne="http://schemas.microsoft.com/office/word/2006/wordml" xmlns:wps="http://schemas.microsoft.com/office/word/2010/wordprocessingShape" mc:Ignorable="w14 w15 w16se w16cid w16 w16cex w16sdtdh w16sdtfl w16du wp14">
   <w:body>
     <w:p/>
     <w:tbl>
@@ -221,8 +221,7 @@
     </w:tbl>
     <w:p>
       <w:pPr>
-        <w:spacing w:after="0" w:line="240" w:lineRule="auto" w:before="120"/>
-        <w:jc w:val="left"/>
+        <w:spacing w:before="120" w:after="0" w:line="240" w:lineRule="auto"/>
         <w:rPr>
           <w:b/>
           <w:bCs/>
@@ -258,7 +257,23 @@
           <w:color w:val="1F3864"/>
           <w:sz w:val="21"/>
         </w:rPr>
-        <w:t xml:space="preserve"> SalonTech · Sección 010V · Octubre de 2026</w:t>
+        <w:t xml:space="preserve"> </w:t>
+      </w:r>
+      <w:proofErr w:type="spellStart"/>
+      <w:r>
+        <w:rPr>
+          <w:color w:val="1F3864"/>
+          <w:sz w:val="21"/>
+        </w:rPr>
+        <w:t>SalonTech</w:t>
+      </w:r>
+      <w:proofErr w:type="spellEnd"/>
+      <w:r>
+        <w:rPr>
+          <w:color w:val="1F3864"/>
+          <w:sz w:val="21"/>
+        </w:rPr>
+        <w:t xml:space="preserve"> · Sección 010V · Octubre de 2026</w:t>
       </w:r>
     </w:p>
     <w:p>
@@ -316,7 +331,25 @@
                 <w:sz w:val="24"/>
                 <w:szCs w:val="24"/>
               </w:rPr>
-              <w:t>1. Mira tu carta Gantt y reflexiona sobre los avances de tu Proyecto APT</w:t>
+              <w:t xml:space="preserve">1. Mira </w:t>
+            </w:r>
+            <w:proofErr w:type="spellStart"/>
+            <w:r>
+              <w:rPr>
+                <w:rFonts w:eastAsiaTheme="majorEastAsia"/>
+                <w:sz w:val="24"/>
+                <w:szCs w:val="24"/>
+              </w:rPr>
+              <w:t>tu</w:t>
+            </w:r>
+            <w:proofErr w:type="spellEnd"/>
+            <w:r>
+              <w:rPr>
+                <w:rFonts w:eastAsiaTheme="majorEastAsia"/>
+                <w:sz w:val="24"/>
+                <w:szCs w:val="24"/>
+              </w:rPr>
+              <w:t xml:space="preserve"> carta Gantt y reflexiona sobre los avances de tu Proyecto APT</w:t>
             </w:r>
           </w:p>
         </w:tc>
@@ -352,46 +385,51 @@
           </w:p>
           <w:p>
             <w:pPr>
-              <w:spacing w:before="160" w:after="120" w:line="240" w:lineRule="auto"/>
+              <w:spacing w:before="160" w:after="120"/>
               <w:jc w:val="both"/>
+              <w:rPr>
+                <w:color w:val="262626"/>
+              </w:rPr>
             </w:pPr>
             <w:r>
               <w:rPr>
                 <w:color w:val="262626"/>
-                <w:sz w:val="22"/>
               </w:rPr>
-              <w:t>No todas, y la diferencia es clara: en desarrollo vamos adelantados y en calidad vamos atrasados. El inventario y el reporte diario, que la carta Gantt ubicaba entre las semanas 12 y 14, quedaron funcionando a fines de septiembre y, como sobró tiempo, se ampliaron con reportes de cualquier período. Lo que no avanzó al mismo ritmo es justamente lo que depende de mi rol: el tablero con los requisitos no se mantuvo al día, la interfaz todavía no tiene pruebas automatizadas y la validación con la clienta no se puede hacer mientras el sistema no esté publicado.</w:t>
+              <w:t>No hemos cumplido todas las actividades en los plazos definidos. Inventario y reporte diario estaban planificados para las semanas 12 a 14, pero quedaron funcionando a fines de septiembre. Eso permitió agregar reportes para distintos períodos. En cambio, no mantuve el tablero de requisitos al día y siguen pendientes las pruebas automatizadas de interfaz y la validación con la clienta.</w:t>
             </w:r>
           </w:p>
           <w:p>
             <w:pPr>
-              <w:spacing w:before="0" w:after="120" w:line="240" w:lineRule="auto"/>
+              <w:spacing w:before="160" w:after="120"/>
               <w:jc w:val="both"/>
+              <w:rPr>
+                <w:color w:val="262626"/>
+              </w:rPr>
             </w:pPr>
             <w:r>
               <w:rPr>
                 <w:color w:val="262626"/>
-                <w:sz w:val="22"/>
               </w:rPr>
-              <w:t>Lo que más facilitó el trabajo fue una decisión de diseño: el stock no es un número que alguien edita, sino el resultado de movimientos que no se pueden modificar ni borrar. Gracias a eso, el reporte cuadró con los pagos desde la primera versión. También ayudó que cada requisito tuviera criterio de aceptación desde la fase 1, porque cada criterio se convirtió casi directamente en un caso de prueba.</w:t>
+              <w:t>Ayudó tener los criterios de aceptación definidos desde la fase 1, porque sirvieron para preparar los casos de prueba. También fue útil que el stock se calculara mediante movimientos que no se pueden editar ni borrar. En las pruebas realizadas, el reporte coincidió con los pagos registrados.</w:t>
             </w:r>
           </w:p>
           <w:p>
             <w:pPr>
-              <w:spacing w:before="0" w:after="120" w:line="240" w:lineRule="auto"/>
+              <w:spacing w:before="160" w:after="120"/>
               <w:jc w:val="both"/>
+              <w:rPr>
+                <w:color w:val="262626"/>
+              </w:rPr>
             </w:pPr>
             <w:r>
               <w:rPr>
                 <w:color w:val="262626"/>
-                <w:sz w:val="22"/>
               </w:rPr>
-              <w:t>Lo que dificultó: no hay nada publicado y todo corre en nuestros computadores; la integración continua de GitHub quedó bloqueada por un cobro fallido en la cuenta, así que las pruebas se corren a mano antes de cada PR, y la carga de las otras asignaturas se nota en las semanas de evaluaciones.</w:t>
+              <w:t>Una dificultad es que el sistema todavía funciona en nuestros computadores y no está publicado. Además, la integración continua de GitHub quedó bloqueada por un cobro fallido en la cuenta, por lo que estamos ejecutando las pruebas manualmente antes de cada PR. La carga de otras asignaturas también ha reducido el tiempo disponible, especialmente en las semanas de evaluaciones.</w:t>
             </w:r>
           </w:p>
           <w:p>
             <w:pPr>
-              <w:spacing w:before="0" w:after="0" w:line="240" w:lineRule="auto"/>
               <w:jc w:val="both"/>
             </w:pPr>
           </w:p>
@@ -489,115 +527,61 @@
           </w:p>
           <w:p>
             <w:pPr>
-              <w:spacing w:before="0" w:after="0" w:line="120" w:lineRule="exact"/>
+              <w:spacing w:line="120" w:lineRule="exact"/>
               <w:jc w:val="both"/>
             </w:pPr>
           </w:p>
           <w:p>
             <w:pPr>
-              <w:numPr>
-                <w:ilvl w:val="0"/>
-                <w:numId w:val="41"/>
-              </w:numPr>
-              <w:spacing w:before="0" w:after="60" w:line="240" w:lineRule="auto"/>
+              <w:spacing w:after="60"/>
+              <w:ind w:left="340"/>
               <w:jc w:val="both"/>
             </w:pPr>
             <w:r>
-              <w:rPr>
-                <w:b/>
-                <w:color w:val="262626"/>
-                <w:sz w:val="22"/>
-              </w:rPr>
-              <w:t>Tablero:</w:t>
+              <w:t xml:space="preserve">Con Alexander nos comprometimos a cargar los 123 requisitos en GitHub </w:t>
             </w:r>
+            <w:proofErr w:type="spellStart"/>
             <w:r>
-              <w:rPr>
-                <w:color w:val="262626"/>
-                <w:sz w:val="22"/>
-              </w:rPr>
-              <w:t xml:space="preserve"> con Alexander nos comprometimos a cargar los 123 requisitos como issues en GitHub Projects antes del 18 de octubre, para que cada funcionalidad se pueda seguir desde el requisito hasta su PR y sus pruebas. Ese mismo día se congela el alcance, y me corresponde cuidar que después no entre nada nuevo.</w:t>
+              <w:t>Projects</w:t>
+            </w:r>
+            <w:proofErr w:type="spellEnd"/>
+            <w:r>
+              <w:t xml:space="preserve"> antes del 18 de octubre. Esto permitirá revisar qué está terminado, qué falta y qué pruebas respaldan cada funcionalidad. Ese día también se cerrará el alcance, y me corresponde revisar que después no se agreguen nuevas funcionalidades.</w:t>
             </w:r>
           </w:p>
           <w:p>
             <w:pPr>
-              <w:numPr>
-                <w:ilvl w:val="0"/>
-                <w:numId w:val="41"/>
-              </w:numPr>
-              <w:spacing w:before="0" w:after="60" w:line="240" w:lineRule="auto"/>
+              <w:spacing w:after="60"/>
+              <w:ind w:left="340"/>
+              <w:jc w:val="both"/>
+            </w:pPr>
+          </w:p>
+          <w:p>
+            <w:pPr>
+              <w:spacing w:after="60"/>
+              <w:ind w:left="340"/>
               <w:jc w:val="both"/>
             </w:pPr>
             <w:r>
-              <w:rPr>
-                <w:b/>
-                <w:color w:val="262626"/>
-                <w:sz w:val="22"/>
-              </w:rPr>
-              <w:t>Pruebas sin integración continua:</w:t>
-            </w:r>
-            <w:r>
-              <w:rPr>
-                <w:color w:val="262626"/>
-                <w:sz w:val="22"/>
-              </w:rPr>
-              <w:t xml:space="preserve"> mientras siga bloqueada, ningún PR se integra sin correr la suite completa contra una base nueva y sin su guion de prueba manual.</w:t>
+              <w:t>Mientras la integración continua siga bloqueada, ejecutaremos todas las pruebas contra una base de datos nueva y revisaremos el guion manual antes de integrar cada PR.</w:t>
             </w:r>
           </w:p>
           <w:p>
             <w:pPr>
-              <w:numPr>
-                <w:ilvl w:val="0"/>
-                <w:numId w:val="41"/>
-              </w:numPr>
-              <w:spacing w:before="0" w:after="60" w:line="240" w:lineRule="auto"/>
+              <w:spacing w:after="60"/>
+              <w:ind w:left="340"/>
+              <w:jc w:val="both"/>
+            </w:pPr>
+          </w:p>
+          <w:p>
+            <w:pPr>
+              <w:spacing w:after="60"/>
+              <w:ind w:left="340"/>
               <w:jc w:val="both"/>
             </w:pPr>
             <w:r>
-              <w:rPr>
-                <w:b/>
-                <w:color w:val="262626"/>
-                <w:sz w:val="22"/>
-              </w:rPr>
-              <w:t>Pruebas de interfaz:</w:t>
+              <w:t>En las semanas 5 y 6 del plan de cierre voy a preparar las pruebas automatizadas de interfaz para los flujos de reserva, pago del abono, atención, cobro y cierre de caja. También prepararé tareas para que la administradora pruebe el sistema cuando esté publicado. Los resultados y las correcciones pendientes quedarán registrados en un acta.</w:t>
             </w:r>
-            <w:r>
-              <w:rPr>
-                <w:color w:val="262626"/>
-                <w:sz w:val="22"/>
-              </w:rPr>
-              <w:t xml:space="preserve"> en las semanas 5 y 6 del plan de cierre voy a automatizar los flujos críticos: reservar, pagar el abono, atender y cobrar, y cerrar la caja.</w:t>
-            </w:r>
-          </w:p>
-          <w:p>
-            <w:pPr>
-              <w:numPr>
-                <w:ilvl w:val="0"/>
-                <w:numId w:val="41"/>
-              </w:numPr>
-              <w:spacing w:before="0" w:after="60" w:line="240" w:lineRule="auto"/>
-              <w:jc w:val="both"/>
-            </w:pPr>
-            <w:r>
-              <w:rPr>
-                <w:b/>
-                <w:color w:val="262626"/>
-                <w:sz w:val="22"/>
-              </w:rPr>
-              <w:t>Validación:</w:t>
-            </w:r>
-            <w:r>
-              <w:rPr>
-                <w:color w:val="262626"/>
-                <w:sz w:val="22"/>
-              </w:rPr>
-              <w:t xml:space="preserve"> voy a preparar una guía con tareas concretas para que la administradora las haga en la versión publicada, y dejar un acta firmada con los resultados y lo que haya que corregir.</w:t>
-            </w:r>
-          </w:p>
-          <w:p>
-            <w:pPr>
-              <w:spacing w:before="0" w:after="0" w:line="240" w:lineRule="auto"/>
-              <w:jc w:val="both"/>
-            </w:pPr>
           </w:p>
         </w:tc>
       </w:tr>
@@ -611,90 +595,6 @@
           <w:sz w:val="24"/>
           <w:szCs w:val="24"/>
           <w:lang w:eastAsia="ja-JP"/>
-        </w:rPr>
-      </w:pPr>
-    </w:p>
-    <w:p>
-      <w:pPr>
-        <w:spacing w:after="0" w:line="360" w:lineRule="auto"/>
-        <w:jc w:val="both"/>
-        <w:rPr>
-          <w:b/>
-          <w:bCs/>
-          <w:sz w:val="24"/>
-          <w:szCs w:val="24"/>
-        </w:rPr>
-      </w:pPr>
-    </w:p>
-    <w:p>
-      <w:pPr>
-        <w:spacing w:after="0" w:line="360" w:lineRule="auto"/>
-        <w:jc w:val="both"/>
-        <w:rPr>
-          <w:b/>
-          <w:bCs/>
-          <w:sz w:val="24"/>
-          <w:szCs w:val="24"/>
-        </w:rPr>
-      </w:pPr>
-    </w:p>
-    <w:p>
-      <w:pPr>
-        <w:spacing w:after="0" w:line="360" w:lineRule="auto"/>
-        <w:jc w:val="both"/>
-        <w:rPr>
-          <w:b/>
-          <w:bCs/>
-          <w:sz w:val="24"/>
-          <w:szCs w:val="24"/>
-        </w:rPr>
-      </w:pPr>
-    </w:p>
-    <w:p>
-      <w:pPr>
-        <w:spacing w:after="0" w:line="360" w:lineRule="auto"/>
-        <w:jc w:val="both"/>
-        <w:rPr>
-          <w:b/>
-          <w:bCs/>
-          <w:sz w:val="24"/>
-          <w:szCs w:val="24"/>
-        </w:rPr>
-      </w:pPr>
-    </w:p>
-    <w:p>
-      <w:pPr>
-        <w:spacing w:after="0" w:line="360" w:lineRule="auto"/>
-        <w:jc w:val="both"/>
-        <w:rPr>
-          <w:b/>
-          <w:bCs/>
-          <w:sz w:val="24"/>
-          <w:szCs w:val="24"/>
-        </w:rPr>
-      </w:pPr>
-    </w:p>
-    <w:p>
-      <w:pPr>
-        <w:spacing w:after="0" w:line="360" w:lineRule="auto"/>
-        <w:jc w:val="both"/>
-        <w:rPr>
-          <w:b/>
-          <w:bCs/>
-          <w:sz w:val="24"/>
-          <w:szCs w:val="24"/>
-        </w:rPr>
-      </w:pPr>
-    </w:p>
-    <w:p>
-      <w:pPr>
-        <w:spacing w:after="0" w:line="360" w:lineRule="auto"/>
-        <w:jc w:val="both"/>
-        <w:rPr>
-          <w:b/>
-          <w:bCs/>
-          <w:sz w:val="24"/>
-          <w:szCs w:val="24"/>
         </w:rPr>
       </w:pPr>
     </w:p>
@@ -784,7 +684,6 @@
                 <w:sz w:val="24"/>
                 <w:szCs w:val="24"/>
               </w:rPr>
-              <w:lastRenderedPageBreak/>
               <w:t>¿Cómo evalúas tu</w:t>
             </w:r>
             <w:r>
@@ -822,33 +721,65 @@
           </w:p>
           <w:p>
             <w:pPr>
-              <w:spacing w:before="160" w:after="120" w:line="240" w:lineRule="auto"/>
+              <w:spacing w:before="160" w:after="120"/>
               <w:jc w:val="both"/>
+              <w:rPr>
+                <w:color w:val="262626"/>
+              </w:rPr>
             </w:pPr>
             <w:r>
               <w:rPr>
                 <w:color w:val="262626"/>
-                <w:sz w:val="22"/>
               </w:rPr>
-              <w:t>En lo técnico, lo evalúo bien. Destaco que el reporte diario cuadra con los pagos registrados y separa servicios de productos, que era justamente lo que la administradora no podía saber con sus cuadernos. Además, cada venta guarda el precio y el costo del momento, así que el reporte de un mes pasado no cambia si después sube un precio.</w:t>
+              <w:t>Estoy conforme con el trabajo técnico de inventario y reportes. El reporte diario permite separar los ingresos por servicios y productos, algo que la administradora no podía identificar fácilmente con sus cuadernos. Además, las ventas conservan el precio y el costo registrados en ese momento, por lo que los reportes anteriores no cambian al modificar los precios.</w:t>
             </w:r>
           </w:p>
           <w:p>
             <w:pPr>
-              <w:spacing w:before="0" w:after="120" w:line="240" w:lineRule="auto"/>
+              <w:spacing w:before="160" w:after="120"/>
               <w:jc w:val="both"/>
+              <w:rPr>
+                <w:color w:val="262626"/>
+              </w:rPr>
             </w:pPr>
             <w:r>
               <w:rPr>
                 <w:color w:val="262626"/>
-                <w:sz w:val="22"/>
               </w:rPr>
-              <w:t>En coordinación, lo evalúo como regular. El tablero no se mantuvo al día y los impedimentos quedaron en el chat del grupo en vez de registrarse. La consecuencia fue concreta: el módulo de acceso se dio por terminado en el Sprint 3 con seis requisitos pendientes, tres de ellos críticos, que estuvieron invisibles durante dos sprints hasta que los cerramos el 15 de septiembre. Para mejorar, voy a llevar el tablero semana a semana, registrar cada impedimento con fecha y responsable, y probar el reporte con la administradora apenas esté publicado. En la fase 1 me propuse mejorar cómo presento los resultados, y eso todavía no lo he podido comprobar con quien los va a leer.</w:t>
+              <w:t xml:space="preserve">En coordinación me faltó constancia. No actualicé el tablero y varios impedimentos quedaron solo en el chat del grupo. El módulo de acceso se dio por terminado en el Sprint 3 con seis requisitos pendientes, tres de ellos críticos. Esos pendientes no quedaron visibles durante dos </w:t>
+            </w:r>
+            <w:proofErr w:type="spellStart"/>
+            <w:r>
+              <w:rPr>
+                <w:color w:val="262626"/>
+              </w:rPr>
+              <w:t>sprints</w:t>
+            </w:r>
+            <w:proofErr w:type="spellEnd"/>
+            <w:r>
+              <w:rPr>
+                <w:color w:val="262626"/>
+              </w:rPr>
+              <w:t xml:space="preserve"> y se cerraron el 15 de septiembre.</w:t>
             </w:r>
           </w:p>
           <w:p>
             <w:pPr>
-              <w:spacing w:before="0" w:after="0" w:line="240" w:lineRule="auto"/>
+              <w:spacing w:before="160" w:after="120"/>
+              <w:jc w:val="both"/>
+              <w:rPr>
+                <w:color w:val="262626"/>
+              </w:rPr>
+            </w:pPr>
+            <w:r>
+              <w:rPr>
+                <w:color w:val="262626"/>
+              </w:rPr>
+              <w:t>Para mejorar, voy a revisar el tablero cada semana y registrar los impedimentos con fecha y responsable. También quiero probar los reportes con la administradora. En la fase 1 me propuse mejorar la presentación de los resultados, pero todavía me falta comprobar si ella los entiende y los encuentra útiles.</w:t>
+            </w:r>
+          </w:p>
+          <w:p>
+            <w:pPr>
               <w:jc w:val="both"/>
             </w:pPr>
           </w:p>
@@ -947,88 +878,25 @@
           </w:p>
           <w:p>
             <w:pPr>
-              <w:keepNext/>
-              <w:spacing w:before="160" w:after="40" w:line="240" w:lineRule="auto"/>
+              <w:spacing w:after="60"/>
               <w:jc w:val="both"/>
             </w:pPr>
             <w:r>
-              <w:rPr>
-                <w:b/>
-                <w:color w:val="262626"/>
-                <w:sz w:val="22"/>
-              </w:rPr>
-              <w:t>Al docente:</w:t>
+              <w:t>Me gustaría preguntarle al docente cómo debemos presentar el plan de pruebas en el informe final: como documento separado o como anexo con los resultados. También quisiera saber si para la validación con la usuaria basta un acta firmada o si debemos medir aspectos como el tiempo por tarea y los errores encontrados.</w:t>
             </w:r>
           </w:p>
           <w:p>
             <w:pPr>
-              <w:numPr>
-                <w:ilvl w:val="0"/>
-                <w:numId w:val="41"/>
-              </w:numPr>
-              <w:spacing w:before="0" w:after="60" w:line="240" w:lineRule="auto"/>
+              <w:spacing w:after="60"/>
               <w:jc w:val="both"/>
             </w:pPr>
             <w:r>
-              <w:rPr>
-                <w:color w:val="262626"/>
-                <w:sz w:val="22"/>
-              </w:rPr>
-              <w:t>¿Cómo espera que presentemos el plan de pruebas en el informe final: como documento aparte o como anexo con los resultados?</w:t>
+              <w:t>A mis compañeros les preguntaría qué flujos deberíamos probar primero. Yo priorizaría el pago del abono y el cierre de caja, porque un error en esas funciones puede afectar los registros de dinero.</w:t>
             </w:r>
           </w:p>
           <w:p>
             <w:pPr>
-              <w:numPr>
-                <w:ilvl w:val="0"/>
-                <w:numId w:val="41"/>
-              </w:numPr>
-              <w:spacing w:before="0" w:after="60" w:line="240" w:lineRule="auto"/>
-              <w:jc w:val="both"/>
-            </w:pPr>
-            <w:r>
-              <w:rPr>
-                <w:color w:val="262626"/>
-                <w:sz w:val="22"/>
-              </w:rPr>
-              <w:t>Para la validación con la usuaria, ¿basta con un acta firmada o espera indicadores medibles, como el tiempo que tarda en registrar una atención o la cantidad de errores por tarea?</w:t>
-            </w:r>
-          </w:p>
-          <w:p>
-            <w:pPr>
-              <w:keepNext/>
-              <w:spacing w:before="0" w:after="40" w:line="240" w:lineRule="auto"/>
-              <w:jc w:val="both"/>
-            </w:pPr>
-            <w:r>
-              <w:rPr>
-                <w:b/>
-                <w:color w:val="262626"/>
-                <w:sz w:val="22"/>
-              </w:rPr>
-              <w:t>A mis compañeros:</w:t>
-            </w:r>
-          </w:p>
-          <w:p>
-            <w:pPr>
-              <w:numPr>
-                <w:ilvl w:val="0"/>
-                <w:numId w:val="41"/>
-              </w:numPr>
-              <w:spacing w:before="0" w:after="60" w:line="240" w:lineRule="auto"/>
-              <w:jc w:val="both"/>
-            </w:pPr>
-            <w:r>
-              <w:rPr>
-                <w:color w:val="262626"/>
-                <w:sz w:val="22"/>
-              </w:rPr>
-              <w:t>¿Qué casos de uso consideran más riesgosos? Yo pondría primero el pago del abono y el cierre de caja, porque ahí hay dinero de por medio, y con esa respuesta ordenaría las pruebas de interfaz.</w:t>
-            </w:r>
-          </w:p>
-          <w:p>
-            <w:pPr>
-              <w:spacing w:before="0" w:after="0" w:line="240" w:lineRule="auto"/>
+              <w:spacing w:after="60"/>
               <w:jc w:val="both"/>
             </w:pPr>
           </w:p>
@@ -1046,6 +914,25 @@
           <w:lang w:eastAsia="ja-JP"/>
         </w:rPr>
       </w:pPr>
+    </w:p>
+    <w:p>
+      <w:pPr>
+        <w:rPr>
+          <w:b/>
+          <w:bCs/>
+          <w:sz w:val="24"/>
+          <w:szCs w:val="24"/>
+        </w:rPr>
+      </w:pPr>
+      <w:r>
+        <w:rPr>
+          <w:b/>
+          <w:bCs/>
+          <w:sz w:val="24"/>
+          <w:szCs w:val="24"/>
+        </w:rPr>
+        <w:br w:type="page"/>
+      </w:r>
     </w:p>
     <w:p>
       <w:pPr>
@@ -1138,20 +1025,65 @@
           </w:p>
           <w:p>
             <w:pPr>
-              <w:spacing w:before="160" w:after="120" w:line="240" w:lineRule="auto"/>
+              <w:spacing w:before="160" w:after="120"/>
               <w:jc w:val="both"/>
+              <w:rPr>
+                <w:color w:val="262626"/>
+              </w:rPr>
             </w:pPr>
             <w:r>
               <w:rPr>
                 <w:color w:val="262626"/>
-                <w:sz w:val="22"/>
               </w:rPr>
-              <w:t>Sí, con ajustes. Como mi módulo terminó antes, puedo concentrarme en lo que es propio de mi rol y quedó atrás: las pruebas de interfaz y la validación con la clienta. Además, tengo la ficha técnica en la semana 2 del plan de cierre. Propongo una actividad nueva a mi cargo: un informe de pruebas que reúna los resultados automatizados, los guiones manuales de cada sprint y lo que salga de la validación, para presentarlo como evidencia final. Lo demás se mantiene como quedó en la ficha 04: José, con la puesta en línea, y Alexander, con los pendientes menores.</w:t>
+              <w:t>Sí, creo que podemos hacer algunos ajustes. Como terminé antes inventario y reporte diario, puedo dedicar más tiempo a las pruebas de interfaz y a preparar la validación con la clienta. También tengo asignada la ficha técnica para la semana 2 del plan de cierre.</w:t>
             </w:r>
           </w:p>
           <w:p>
             <w:pPr>
-              <w:spacing w:before="0" w:after="0" w:line="240" w:lineRule="auto"/>
+              <w:spacing w:before="160" w:after="120"/>
+              <w:jc w:val="both"/>
+              <w:rPr>
+                <w:color w:val="262626"/>
+              </w:rPr>
+            </w:pPr>
+            <w:r>
+              <w:rPr>
+                <w:color w:val="262626"/>
+              </w:rPr>
+              <w:t xml:space="preserve">Propongo agregar un informe de pruebas a mi cargo. En él reuniría los resultados de las pruebas automatizadas, los guiones manuales de los </w:t>
+            </w:r>
+            <w:proofErr w:type="spellStart"/>
+            <w:r>
+              <w:rPr>
+                <w:color w:val="262626"/>
+              </w:rPr>
+              <w:t>sprints</w:t>
+            </w:r>
+            <w:proofErr w:type="spellEnd"/>
+            <w:r>
+              <w:rPr>
+                <w:color w:val="262626"/>
+              </w:rPr>
+              <w:t xml:space="preserve"> y los resultados de la validación con la administradora.</w:t>
+            </w:r>
+          </w:p>
+          <w:p>
+            <w:pPr>
+              <w:spacing w:before="160" w:after="120"/>
+              <w:jc w:val="both"/>
+              <w:rPr>
+                <w:color w:val="262626"/>
+              </w:rPr>
+            </w:pPr>
+            <w:r>
+              <w:rPr>
+                <w:color w:val="262626"/>
+              </w:rPr>
+              <w:t>Las demás responsabilidades se mantendrían como están en la ficha 04: José se encargaría de la puesta en línea y Alexander de los pendientes menores.</w:t>
+            </w:r>
+          </w:p>
+          <w:p>
+            <w:pPr>
               <w:jc w:val="both"/>
             </w:pPr>
           </w:p>
@@ -1235,8 +1167,6 @@
               </w:rPr>
               <w:t>. APT  grupal</w:t>
             </w:r>
-            <w:bookmarkStart w:id="0" w:name="_GoBack"/>
-            <w:bookmarkEnd w:id="0"/>
           </w:p>
         </w:tc>
       </w:tr>
@@ -1271,33 +1201,36 @@
           </w:p>
           <w:p>
             <w:pPr>
-              <w:spacing w:before="160" w:after="120" w:line="240" w:lineRule="auto"/>
+              <w:spacing w:before="160" w:after="120"/>
               <w:jc w:val="both"/>
+              <w:rPr>
+                <w:color w:val="262626"/>
+              </w:rPr>
             </w:pPr>
             <w:r>
               <w:rPr>
                 <w:color w:val="262626"/>
-                <w:sz w:val="22"/>
               </w:rPr>
-              <w:t>Lo positivo es que los perfiles se complementan: José aporta la base de datos y la seguridad, Alexander la relación con la clienta y con el docente, y yo los datos y la calidad. Cuando hubo que tomar decisiones grandes, como cambiar Mercado Pago por Webpay, se tomaron rápido y quedaron documentadas con sus razones.</w:t>
+              <w:t>Nos ha servido que cada uno se encargue de una parte distinta del proyecto. José ha trabajado en la base de datos y la seguridad; Alexander ha mantenido el contacto con la clienta y el docente; y yo me he concentrado en inventario, reportes y calidad. Cuando tuvimos que cambiar Mercado Pago por Webpay, pudimos decidirlo rápidamente y dejamos registradas las razones.</w:t>
             </w:r>
           </w:p>
           <w:p>
             <w:pPr>
-              <w:spacing w:before="0" w:after="120" w:line="240" w:lineRule="auto"/>
+              <w:spacing w:before="160" w:after="120"/>
               <w:jc w:val="both"/>
+              <w:rPr>
+                <w:color w:val="262626"/>
+              </w:rPr>
             </w:pPr>
             <w:r>
               <w:rPr>
                 <w:color w:val="262626"/>
-                <w:sz w:val="22"/>
               </w:rPr>
-              <w:t>Lo que podemos mejorar es registrar los impedimentos en el tablero y no solo en el chat, y repartir mejor la integración, que hoy pasa casi toda por un mismo computador. Si ese equipo falla o esa persona no está disponible, el proyecto se detiene, y es un riesgo que tenemos que bajar antes de la entrega final.</w:t>
+              <w:t>Nos falta mejorar el seguimiento de los problemas. Varias cosas se conversan en el chat, pero después no quedan registradas en el tablero. También debemos repartir mejor la integración, porque actualmente depende casi por completo de un mismo computador. Si ese equipo falla o la persona que lo utiliza no está disponible, se retrasa el trabajo del grupo. Necesitamos resolver esa dependencia antes de la entrega final.</w:t>
             </w:r>
           </w:p>
           <w:p>
             <w:pPr>
-              <w:spacing w:before="0" w:after="0" w:line="240" w:lineRule="auto"/>
               <w:jc w:val="both"/>
             </w:pPr>
           </w:p>
@@ -1343,7 +1276,7 @@
 </file>
 
 <file path=word/endnotes.xml><?xml version="1.0" encoding="utf-8"?>
-<w:endnotes xmlns:wpc="http://schemas.microsoft.com/office/word/2010/wordprocessingCanvas" xmlns:cx="http://schemas.microsoft.com/office/drawing/2014/chartex" xmlns:mc="http://schemas.openxmlformats.org/markup-compatibility/2006" xmlns:o="urn:schemas-microsoft-com:office:office" xmlns:r="http://schemas.openxmlformats.org/officeDocument/2006/relationships" xmlns:m="http://schemas.openxmlformats.org/officeDocument/2006/math" xmlns:v="urn:schemas-microsoft-com:vml" xmlns:wp14="http://schemas.microsoft.com/office/word/2010/wordprocessingDrawing" xmlns:wp="http://schemas.openxmlformats.org/drawingml/2006/wordprocessingDrawing" xmlns:w10="urn:schemas-microsoft-com:office:word" xmlns:w="http://schemas.openxmlformats.org/wordprocessingml/2006/main" xmlns:w14="http://schemas.microsoft.com/office/word/2010/wordml" xmlns:w15="http://schemas.microsoft.com/office/word/2012/wordml" xmlns:w16se="http://schemas.microsoft.com/office/word/2015/wordml/symex" xmlns:wpg="http://schemas.microsoft.com/office/word/2010/wordprocessingGroup" xmlns:wpi="http://schemas.microsoft.com/office/word/2010/wordprocessingInk" xmlns:wne="http://schemas.microsoft.com/office/word/2006/wordml" xmlns:wps="http://schemas.microsoft.com/office/word/2010/wordprocessingShape" mc:Ignorable="w14 w15 w16se wp14">
+<w:endnotes xmlns:wpc="http://schemas.microsoft.com/office/word/2010/wordprocessingCanvas" xmlns:cx="http://schemas.microsoft.com/office/drawing/2014/chartex" xmlns:cx1="http://schemas.microsoft.com/office/drawing/2015/9/8/chartex" xmlns:cx2="http://schemas.microsoft.com/office/drawing/2015/10/21/chartex" xmlns:cx3="http://schemas.microsoft.com/office/drawing/2016/5/9/chartex" xmlns:cx4="http://schemas.microsoft.com/office/drawing/2016/5/10/chartex" xmlns:cx5="http://schemas.microsoft.com/office/drawing/2016/5/11/chartex" xmlns:cx6="http://schemas.microsoft.com/office/drawing/2016/5/12/chartex" xmlns:cx7="http://schemas.microsoft.com/office/drawing/2016/5/13/chartex" xmlns:cx8="http://schemas.microsoft.com/office/drawing/2016/5/14/chartex" xmlns:mc="http://schemas.openxmlformats.org/markup-compatibility/2006" xmlns:aink="http://schemas.microsoft.com/office/drawing/2016/ink" xmlns:am3d="http://schemas.microsoft.com/office/drawing/2017/model3d" xmlns:o="urn:schemas-microsoft-com:office:office" xmlns:oel="http://schemas.microsoft.com/office/2019/extlst" xmlns:r="http://schemas.openxmlformats.org/officeDocument/2006/relationships" xmlns:m="http://schemas.openxmlformats.org/officeDocument/2006/math" xmlns:v="urn:schemas-microsoft-com:vml" xmlns:wp14="http://schemas.microsoft.com/office/word/2010/wordprocessingDrawing" xmlns:wp="http://schemas.openxmlformats.org/drawingml/2006/wordprocessingDrawing" xmlns:w10="urn:schemas-microsoft-com:office:word" xmlns:w="http://schemas.openxmlformats.org/wordprocessingml/2006/main" xmlns:w14="http://schemas.microsoft.com/office/word/2010/wordml" xmlns:w15="http://schemas.microsoft.com/office/word/2012/wordml" xmlns:w16cex="http://schemas.microsoft.com/office/word/2018/wordml/cex" xmlns:w16cid="http://schemas.microsoft.com/office/word/2016/wordml/cid" xmlns:w16="http://schemas.microsoft.com/office/word/2018/wordml" xmlns:w16du="http://schemas.microsoft.com/office/word/2023/wordml/word16du" xmlns:w16sdtdh="http://schemas.microsoft.com/office/word/2020/wordml/sdtdatahash" xmlns:w16sdtfl="http://schemas.microsoft.com/office/word/2024/wordml/sdtformatlock" xmlns:w16se="http://schemas.microsoft.com/office/word/2015/wordml/symex" xmlns:wpg="http://schemas.microsoft.com/office/word/2010/wordprocessingGroup" xmlns:wpi="http://schemas.microsoft.com/office/word/2010/wordprocessingInk" xmlns:wne="http://schemas.microsoft.com/office/word/2006/wordml" xmlns:wps="http://schemas.microsoft.com/office/word/2010/wordprocessingShape" mc:Ignorable="w14 w15 w16se w16cid w16 w16cex w16sdtdh w16sdtfl w16du wp14">
   <w:endnote w:type="separator" w:id="-1">
     <w:p>
       <w:pPr>
@@ -1368,7 +1301,7 @@
 </file>
 
 <file path=word/footer1.xml><?xml version="1.0" encoding="utf-8"?>
-<w:ftr xmlns:wpc="http://schemas.microsoft.com/office/word/2010/wordprocessingCanvas" xmlns:cx="http://schemas.microsoft.com/office/drawing/2014/chartex" xmlns:mc="http://schemas.openxmlformats.org/markup-compatibility/2006" xmlns:o="urn:schemas-microsoft-com:office:office" xmlns:r="http://schemas.openxmlformats.org/officeDocument/2006/relationships" xmlns:m="http://schemas.openxmlformats.org/officeDocument/2006/math" xmlns:v="urn:schemas-microsoft-com:vml" xmlns:wp14="http://schemas.microsoft.com/office/word/2010/wordprocessingDrawing" xmlns:wp="http://schemas.openxmlformats.org/drawingml/2006/wordprocessingDrawing" xmlns:w10="urn:schemas-microsoft-com:office:word" xmlns:w="http://schemas.openxmlformats.org/wordprocessingml/2006/main" xmlns:w14="http://schemas.microsoft.com/office/word/2010/wordml" xmlns:w15="http://schemas.microsoft.com/office/word/2012/wordml" xmlns:w16se="http://schemas.microsoft.com/office/word/2015/wordml/symex" xmlns:wpg="http://schemas.microsoft.com/office/word/2010/wordprocessingGroup" xmlns:wpi="http://schemas.microsoft.com/office/word/2010/wordprocessingInk" xmlns:wne="http://schemas.microsoft.com/office/word/2006/wordml" xmlns:wps="http://schemas.microsoft.com/office/word/2010/wordprocessingShape" mc:Ignorable="w14 w15 w16se wp14">
+<w:ftr xmlns:wpc="http://schemas.microsoft.com/office/word/2010/wordprocessingCanvas" xmlns:cx="http://schemas.microsoft.com/office/drawing/2014/chartex" xmlns:cx1="http://schemas.microsoft.com/office/drawing/2015/9/8/chartex" xmlns:cx2="http://schemas.microsoft.com/office/drawing/2015/10/21/chartex" xmlns:cx3="http://schemas.microsoft.com/office/drawing/2016/5/9/chartex" xmlns:cx4="http://schemas.microsoft.com/office/drawing/2016/5/10/chartex" xmlns:cx5="http://schemas.microsoft.com/office/drawing/2016/5/11/chartex" xmlns:cx6="http://schemas.microsoft.com/office/drawing/2016/5/12/chartex" xmlns:cx7="http://schemas.microsoft.com/office/drawing/2016/5/13/chartex" xmlns:cx8="http://schemas.microsoft.com/office/drawing/2016/5/14/chartex" xmlns:mc="http://schemas.openxmlformats.org/markup-compatibility/2006" xmlns:aink="http://schemas.microsoft.com/office/drawing/2016/ink" xmlns:am3d="http://schemas.microsoft.com/office/drawing/2017/model3d" xmlns:o="urn:schemas-microsoft-com:office:office" xmlns:oel="http://schemas.microsoft.com/office/2019/extlst" xmlns:r="http://schemas.openxmlformats.org/officeDocument/2006/relationships" xmlns:m="http://schemas.openxmlformats.org/officeDocument/2006/math" xmlns:v="urn:schemas-microsoft-com:vml" xmlns:wp14="http://schemas.microsoft.com/office/word/2010/wordprocessingDrawing" xmlns:wp="http://schemas.openxmlformats.org/drawingml/2006/wordprocessingDrawing" xmlns:w10="urn:schemas-microsoft-com:office:word" xmlns:w="http://schemas.openxmlformats.org/wordprocessingml/2006/main" xmlns:w14="http://schemas.microsoft.com/office/word/2010/wordml" xmlns:w15="http://schemas.microsoft.com/office/word/2012/wordml" xmlns:w16cex="http://schemas.microsoft.com/office/word/2018/wordml/cex" xmlns:w16cid="http://schemas.microsoft.com/office/word/2016/wordml/cid" xmlns:w16="http://schemas.microsoft.com/office/word/2018/wordml" xmlns:w16du="http://schemas.microsoft.com/office/word/2023/wordml/word16du" xmlns:w16sdtdh="http://schemas.microsoft.com/office/word/2020/wordml/sdtdatahash" xmlns:w16sdtfl="http://schemas.microsoft.com/office/word/2024/wordml/sdtformatlock" xmlns:w16se="http://schemas.microsoft.com/office/word/2015/wordml/symex" xmlns:wpg="http://schemas.microsoft.com/office/word/2010/wordprocessingGroup" xmlns:wpi="http://schemas.microsoft.com/office/word/2010/wordprocessingInk" xmlns:wne="http://schemas.microsoft.com/office/word/2006/wordml" xmlns:wps="http://schemas.microsoft.com/office/word/2010/wordprocessingShape" mc:Ignorable="w14 w15 w16se w16cid w16 w16cex w16sdtdh w16sdtfl w16du wp14">
   <w:sdt>
     <w:sdtPr>
       <w:id w:val="-937982979"/>
@@ -1377,7 +1310,6 @@
         <w:docPartUnique/>
       </w:docPartObj>
     </w:sdtPr>
-    <w:sdtEndPr/>
     <w:sdtContent>
       <w:p>
         <w:pPr>
@@ -1589,7 +1521,7 @@
             </mc:Choice>
             <mc:Fallback>
               <w:pict>
-                <v:group w14:anchorId="51D00065" id="Grupo 32" o:spid="_x0000_s1026" style="position:absolute;margin-left:0;margin-top:0;width:610.5pt;height:15pt;z-index:251659264;mso-width-percent:1000;mso-position-horizontal:center;mso-position-horizontal-relative:page;mso-position-vertical:center;mso-position-vertical-relative:bottom-margin-area;mso-width-percent:1000" coordorigin=",14970" coordsize="12255,300" o:gfxdata="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">
+                <v:group w14:anchorId="51D00065" id="Grupo 32" o:spid="_x0000_s1026" style="position:absolute;margin-left:0;margin-top:0;width:610.5pt;height:15pt;z-index:251659264;mso-width-percent:1000;mso-position-horizontal:center;mso-position-horizontal-relative:page;mso-position-vertical:center;mso-position-vertical-relative:bottom-margin-area;mso-width-percent:1000" coordorigin=",14970" coordsize="12255,300" o:gfxdata="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">
                   <v:shapetype id="_x0000_t202" coordsize="21600,21600" o:spt="202" path="m,l,21600r21600,l21600,xe">
                     <v:stroke joinstyle="miter"/>
                     <v:path gradientshapeok="t" o:connecttype="rect"/>
@@ -1656,7 +1588,7 @@
 </file>
 
 <file path=word/footnotes.xml><?xml version="1.0" encoding="utf-8"?>
-<w:footnotes xmlns:wpc="http://schemas.microsoft.com/office/word/2010/wordprocessingCanvas" xmlns:cx="http://schemas.microsoft.com/office/drawing/2014/chartex" xmlns:mc="http://schemas.openxmlformats.org/markup-compatibility/2006" xmlns:o="urn:schemas-microsoft-com:office:office" xmlns:r="http://schemas.openxmlformats.org/officeDocument/2006/relationships" xmlns:m="http://schemas.openxmlformats.org/officeDocument/2006/math" xmlns:v="urn:schemas-microsoft-com:vml" xmlns:wp14="http://schemas.microsoft.com/office/word/2010/wordprocessingDrawing" xmlns:wp="http://schemas.openxmlformats.org/drawingml/2006/wordprocessingDrawing" xmlns:w10="urn:schemas-microsoft-com:office:word" xmlns:w="http://schemas.openxmlformats.org/wordprocessingml/2006/main" xmlns:w14="http://schemas.microsoft.com/office/word/2010/wordml" xmlns:w15="http://schemas.microsoft.com/office/word/2012/wordml" xmlns:w16se="http://schemas.microsoft.com/office/word/2015/wordml/symex" xmlns:wpg="http://schemas.microsoft.com/office/word/2010/wordprocessingGroup" xmlns:wpi="http://schemas.microsoft.com/office/word/2010/wordprocessingInk" xmlns:wne="http://schemas.microsoft.com/office/word/2006/wordml" xmlns:wps="http://schemas.microsoft.com/office/word/2010/wordprocessingShape" mc:Ignorable="w14 w15 w16se wp14">
+<w:footnotes xmlns:wpc="http://schemas.microsoft.com/office/word/2010/wordprocessingCanvas" xmlns:cx="http://schemas.microsoft.com/office/drawing/2014/chartex" xmlns:cx1="http://schemas.microsoft.com/office/drawing/2015/9/8/chartex" xmlns:cx2="http://schemas.microsoft.com/office/drawing/2015/10/21/chartex" xmlns:cx3="http://schemas.microsoft.com/office/drawing/2016/5/9/chartex" xmlns:cx4="http://schemas.microsoft.com/office/drawing/2016/5/10/chartex" xmlns:cx5="http://schemas.microsoft.com/office/drawing/2016/5/11/chartex" xmlns:cx6="http://schemas.microsoft.com/office/drawing/2016/5/12/chartex" xmlns:cx7="http://schemas.microsoft.com/office/drawing/2016/5/13/chartex" xmlns:cx8="http://schemas.microsoft.com/office/drawing/2016/5/14/chartex" xmlns:mc="http://schemas.openxmlformats.org/markup-compatibility/2006" xmlns:aink="http://schemas.microsoft.com/office/drawing/2016/ink" xmlns:am3d="http://schemas.microsoft.com/office/drawing/2017/model3d" xmlns:o="urn:schemas-microsoft-com:office:office" xmlns:oel="http://schemas.microsoft.com/office/2019/extlst" xmlns:r="http://schemas.openxmlformats.org/officeDocument/2006/relationships" xmlns:m="http://schemas.openxmlformats.org/officeDocument/2006/math" xmlns:v="urn:schemas-microsoft-com:vml" xmlns:wp14="http://schemas.microsoft.com/office/word/2010/wordprocessingDrawing" xmlns:wp="http://schemas.openxmlformats.org/drawingml/2006/wordprocessingDrawing" xmlns:w10="urn:schemas-microsoft-com:office:word" xmlns:w="http://schemas.openxmlformats.org/wordprocessingml/2006/main" xmlns:w14="http://schemas.microsoft.com/office/word/2010/wordml" xmlns:w15="http://schemas.microsoft.com/office/word/2012/wordml" xmlns:w16cex="http://schemas.microsoft.com/office/word/2018/wordml/cex" xmlns:w16cid="http://schemas.microsoft.com/office/word/2016/wordml/cid" xmlns:w16="http://schemas.microsoft.com/office/word/2018/wordml" xmlns:w16du="http://schemas.microsoft.com/office/word/2023/wordml/word16du" xmlns:w16sdtdh="http://schemas.microsoft.com/office/word/2020/wordml/sdtdatahash" xmlns:w16sdtfl="http://schemas.microsoft.com/office/word/2024/wordml/sdtformatlock" xmlns:w16se="http://schemas.microsoft.com/office/word/2015/wordml/symex" xmlns:wpg="http://schemas.microsoft.com/office/word/2010/wordprocessingGroup" xmlns:wpi="http://schemas.microsoft.com/office/word/2010/wordprocessingInk" xmlns:wne="http://schemas.microsoft.com/office/word/2006/wordml" xmlns:wps="http://schemas.microsoft.com/office/word/2010/wordprocessingShape" mc:Ignorable="w14 w15 w16se w16cid w16 w16cex w16sdtdh w16sdtfl w16du wp14">
   <w:footnote w:type="separator" w:id="-1">
     <w:p>
       <w:pPr>
@@ -1681,7 +1613,7 @@
 </file>
 
 <file path=word/header1.xml><?xml version="1.0" encoding="utf-8"?>
-<w:hdr xmlns:wpc="http://schemas.microsoft.com/office/word/2010/wordprocessingCanvas" xmlns:cx="http://schemas.microsoft.com/office/drawing/2014/chartex" xmlns:mc="http://schemas.openxmlformats.org/markup-compatibility/2006" xmlns:o="urn:schemas-microsoft-com:office:office" xmlns:r="http://schemas.openxmlformats.org/officeDocument/2006/relationships" xmlns:m="http://schemas.openxmlformats.org/officeDocument/2006/math" xmlns:v="urn:schemas-microsoft-com:vml" xmlns:wp14="http://schemas.microsoft.com/office/word/2010/wordprocessingDrawing" xmlns:wp="http://schemas.openxmlformats.org/drawingml/2006/wordprocessingDrawing" xmlns:w10="urn:schemas-microsoft-com:office:word" xmlns:w="http://schemas.openxmlformats.org/wordprocessingml/2006/main" xmlns:w14="http://schemas.microsoft.com/office/word/2010/wordml" xmlns:w15="http://schemas.microsoft.com/office/word/2012/wordml" xmlns:w16se="http://schemas.microsoft.com/office/word/2015/wordml/symex" xmlns:wpg="http://schemas.microsoft.com/office/word/2010/wordprocessingGroup" xmlns:wpi="http://schemas.microsoft.com/office/word/2010/wordprocessingInk" xmlns:wne="http://schemas.microsoft.com/office/word/2006/wordml" xmlns:wps="http://schemas.microsoft.com/office/word/2010/wordprocessingShape" mc:Ignorable="w14 w15 w16se wp14">
+<w:hdr xmlns:wpc="http://schemas.microsoft.com/office/word/2010/wordprocessingCanvas" xmlns:cx="http://schemas.microsoft.com/office/drawing/2014/chartex" xmlns:cx1="http://schemas.microsoft.com/office/drawing/2015/9/8/chartex" xmlns:cx2="http://schemas.microsoft.com/office/drawing/2015/10/21/chartex" xmlns:cx3="http://schemas.microsoft.com/office/drawing/2016/5/9/chartex" xmlns:cx4="http://schemas.microsoft.com/office/drawing/2016/5/10/chartex" xmlns:cx5="http://schemas.microsoft.com/office/drawing/2016/5/11/chartex" xmlns:cx6="http://schemas.microsoft.com/office/drawing/2016/5/12/chartex" xmlns:cx7="http://schemas.microsoft.com/office/drawing/2016/5/13/chartex" xmlns:cx8="http://schemas.microsoft.com/office/drawing/2016/5/14/chartex" xmlns:mc="http://schemas.openxmlformats.org/markup-compatibility/2006" xmlns:aink="http://schemas.microsoft.com/office/drawing/2016/ink" xmlns:am3d="http://schemas.microsoft.com/office/drawing/2017/model3d" xmlns:o="urn:schemas-microsoft-com:office:office" xmlns:oel="http://schemas.microsoft.com/office/2019/extlst" xmlns:r="http://schemas.openxmlformats.org/officeDocument/2006/relationships" xmlns:m="http://schemas.openxmlformats.org/officeDocument/2006/math" xmlns:v="urn:schemas-microsoft-com:vml" xmlns:wp14="http://schemas.microsoft.com/office/word/2010/wordprocessingDrawing" xmlns:wp="http://schemas.openxmlformats.org/drawingml/2006/wordprocessingDrawing" xmlns:w10="urn:schemas-microsoft-com:office:word" xmlns:w="http://schemas.openxmlformats.org/wordprocessingml/2006/main" xmlns:w14="http://schemas.microsoft.com/office/word/2010/wordml" xmlns:w15="http://schemas.microsoft.com/office/word/2012/wordml" xmlns:w16cex="http://schemas.microsoft.com/office/word/2018/wordml/cex" xmlns:w16cid="http://schemas.microsoft.com/office/word/2016/wordml/cid" xmlns:w16="http://schemas.microsoft.com/office/word/2018/wordml" xmlns:w16du="http://schemas.microsoft.com/office/word/2023/wordml/word16du" xmlns:w16sdtdh="http://schemas.microsoft.com/office/word/2020/wordml/sdtdatahash" xmlns:w16sdtfl="http://schemas.microsoft.com/office/word/2024/wordml/sdtformatlock" xmlns:w16se="http://schemas.microsoft.com/office/word/2015/wordml/symex" xmlns:wpg="http://schemas.microsoft.com/office/word/2010/wordprocessingGroup" xmlns:wpi="http://schemas.microsoft.com/office/word/2010/wordprocessingInk" xmlns:wne="http://schemas.microsoft.com/office/word/2006/wordml" xmlns:wps="http://schemas.microsoft.com/office/word/2010/wordprocessingShape" mc:Ignorable="w14 w15 w16se w16cid w16 w16cex w16sdtdh w16sdtfl w16du wp14">
   <w:tbl>
     <w:tblPr>
       <w:tblStyle w:val="Tablaconcuadrcula"/>
@@ -1861,7 +1793,7 @@
 </file>
 
 <file path=word/header2.xml><?xml version="1.0" encoding="utf-8"?>
-<w:hdr xmlns:wpc="http://schemas.microsoft.com/office/word/2010/wordprocessingCanvas" xmlns:cx="http://schemas.microsoft.com/office/drawing/2014/chartex" xmlns:mc="http://schemas.openxmlformats.org/markup-compatibility/2006" xmlns:o="urn:schemas-microsoft-com:office:office" xmlns:r="http://schemas.openxmlformats.org/officeDocument/2006/relationships" xmlns:m="http://schemas.openxmlformats.org/officeDocument/2006/math" xmlns:v="urn:schemas-microsoft-com:vml" xmlns:wp14="http://schemas.microsoft.com/office/word/2010/wordprocessingDrawing" xmlns:wp="http://schemas.openxmlformats.org/drawingml/2006/wordprocessingDrawing" xmlns:w10="urn:schemas-microsoft-com:office:word" xmlns:w="http://schemas.openxmlformats.org/wordprocessingml/2006/main" xmlns:w14="http://schemas.microsoft.com/office/word/2010/wordml" xmlns:w15="http://schemas.microsoft.com/office/word/2012/wordml" xmlns:w16se="http://schemas.microsoft.com/office/word/2015/wordml/symex" xmlns:wpg="http://schemas.microsoft.com/office/word/2010/wordprocessingGroup" xmlns:wpi="http://schemas.microsoft.com/office/word/2010/wordprocessingInk" xmlns:wne="http://schemas.microsoft.com/office/word/2006/wordml" xmlns:wps="http://schemas.microsoft.com/office/word/2010/wordprocessingShape" mc:Ignorable="w14 w15 w16se wp14">
+<w:hdr xmlns:wpc="http://schemas.microsoft.com/office/word/2010/wordprocessingCanvas" xmlns:cx="http://schemas.microsoft.com/office/drawing/2014/chartex" xmlns:cx1="http://schemas.microsoft.com/office/drawing/2015/9/8/chartex" xmlns:cx2="http://schemas.microsoft.com/office/drawing/2015/10/21/chartex" xmlns:cx3="http://schemas.microsoft.com/office/drawing/2016/5/9/chartex" xmlns:cx4="http://schemas.microsoft.com/office/drawing/2016/5/10/chartex" xmlns:cx5="http://schemas.microsoft.com/office/drawing/2016/5/11/chartex" xmlns:cx6="http://schemas.microsoft.com/office/drawing/2016/5/12/chartex" xmlns:cx7="http://schemas.microsoft.com/office/drawing/2016/5/13/chartex" xmlns:cx8="http://schemas.microsoft.com/office/drawing/2016/5/14/chartex" xmlns:mc="http://schemas.openxmlformats.org/markup-compatibility/2006" xmlns:aink="http://schemas.microsoft.com/office/drawing/2016/ink" xmlns:am3d="http://schemas.microsoft.com/office/drawing/2017/model3d" xmlns:o="urn:schemas-microsoft-com:office:office" xmlns:oel="http://schemas.microsoft.com/office/2019/extlst" xmlns:r="http://schemas.openxmlformats.org/officeDocument/2006/relationships" xmlns:m="http://schemas.openxmlformats.org/officeDocument/2006/math" xmlns:v="urn:schemas-microsoft-com:vml" xmlns:wp14="http://schemas.microsoft.com/office/word/2010/wordprocessingDrawing" xmlns:wp="http://schemas.openxmlformats.org/drawingml/2006/wordprocessingDrawing" xmlns:w10="urn:schemas-microsoft-com:office:word" xmlns:w="http://schemas.openxmlformats.org/wordprocessingml/2006/main" xmlns:w14="http://schemas.microsoft.com/office/word/2010/wordml" xmlns:w15="http://schemas.microsoft.com/office/word/2012/wordml" xmlns:w16cex="http://schemas.microsoft.com/office/word/2018/wordml/cex" xmlns:w16cid="http://schemas.microsoft.com/office/word/2016/wordml/cid" xmlns:w16="http://schemas.microsoft.com/office/word/2018/wordml" xmlns:w16du="http://schemas.microsoft.com/office/word/2023/wordml/word16du" xmlns:w16sdtdh="http://schemas.microsoft.com/office/word/2020/wordml/sdtdatahash" xmlns:w16sdtfl="http://schemas.microsoft.com/office/word/2024/wordml/sdtformatlock" xmlns:w16se="http://schemas.microsoft.com/office/word/2015/wordml/symex" xmlns:wpg="http://schemas.microsoft.com/office/word/2010/wordprocessingGroup" xmlns:wpi="http://schemas.microsoft.com/office/word/2010/wordprocessingInk" xmlns:wne="http://schemas.microsoft.com/office/word/2006/wordml" xmlns:wps="http://schemas.microsoft.com/office/word/2010/wordprocessingShape" mc:Ignorable="w14 w15 w16se w16cid w16 w16cex w16sdtdh w16sdtfl w16du wp14">
   <w:tbl>
     <w:tblPr>
       <w:tblStyle w:val="Tablaconcuadrcula"/>
@@ -2136,7 +2068,7 @@
 </file>
 
 <file path=word/numbering.xml><?xml version="1.0" encoding="utf-8"?>
-<w:numbering xmlns:wpc="http://schemas.microsoft.com/office/word/2010/wordprocessingCanvas" xmlns:cx="http://schemas.microsoft.com/office/drawing/2014/chartex" xmlns:mc="http://schemas.openxmlformats.org/markup-compatibility/2006" xmlns:o="urn:schemas-microsoft-com:office:office" xmlns:r="http://schemas.openxmlformats.org/officeDocument/2006/relationships" xmlns:m="http://schemas.openxmlformats.org/officeDocument/2006/math" xmlns:v="urn:schemas-microsoft-com:vml" xmlns:wp14="http://schemas.microsoft.com/office/word/2010/wordprocessingDrawing" xmlns:wp="http://schemas.openxmlformats.org/drawingml/2006/wordprocessingDrawing" xmlns:w10="urn:schemas-microsoft-com:office:word" xmlns:w="http://schemas.openxmlformats.org/wordprocessingml/2006/main" xmlns:w14="http://schemas.microsoft.com/office/word/2010/wordml" xmlns:w15="http://schemas.microsoft.com/office/word/2012/wordml" xmlns:w16se="http://schemas.microsoft.com/office/word/2015/wordml/symex" xmlns:wpg="http://schemas.microsoft.com/office/word/2010/wordprocessingGroup" xmlns:wpi="http://schemas.microsoft.com/office/word/2010/wordprocessingInk" xmlns:wne="http://schemas.microsoft.com/office/word/2006/wordml" xmlns:wps="http://schemas.microsoft.com/office/word/2010/wordprocessingShape" mc:Ignorable="w14 w15 w16se wp14">
+<w:numbering xmlns:wpc="http://schemas.microsoft.com/office/word/2010/wordprocessingCanvas" xmlns:cx="http://schemas.microsoft.com/office/drawing/2014/chartex" xmlns:cx1="http://schemas.microsoft.com/office/drawing/2015/9/8/chartex" xmlns:cx2="http://schemas.microsoft.com/office/drawing/2015/10/21/chartex" xmlns:cx3="http://schemas.microsoft.com/office/drawing/2016/5/9/chartex" xmlns:cx4="http://schemas.microsoft.com/office/drawing/2016/5/10/chartex" xmlns:cx5="http://schemas.microsoft.com/office/drawing/2016/5/11/chartex" xmlns:cx6="http://schemas.microsoft.com/office/drawing/2016/5/12/chartex" xmlns:cx7="http://schemas.microsoft.com/office/drawing/2016/5/13/chartex" xmlns:cx8="http://schemas.microsoft.com/office/drawing/2016/5/14/chartex" xmlns:mc="http://schemas.openxmlformats.org/markup-compatibility/2006" xmlns:aink="http://schemas.microsoft.com/office/drawing/2016/ink" xmlns:am3d="http://schemas.microsoft.com/office/drawing/2017/model3d" xmlns:o="urn:schemas-microsoft-com:office:office" xmlns:oel="http://schemas.microsoft.com/office/2019/extlst" xmlns:r="http://schemas.openxmlformats.org/officeDocument/2006/relationships" xmlns:m="http://schemas.openxmlformats.org/officeDocument/2006/math" xmlns:v="urn:schemas-microsoft-com:vml" xmlns:wp14="http://schemas.microsoft.com/office/word/2010/wordprocessingDrawing" xmlns:wp="http://schemas.openxmlformats.org/drawingml/2006/wordprocessingDrawing" xmlns:w10="urn:schemas-microsoft-com:office:word" xmlns:w="http://schemas.openxmlformats.org/wordprocessingml/2006/main" xmlns:w14="http://schemas.microsoft.com/office/word/2010/wordml" xmlns:w15="http://schemas.microsoft.com/office/word/2012/wordml" xmlns:w16cex="http://schemas.microsoft.com/office/word/2018/wordml/cex" xmlns:w16cid="http://schemas.microsoft.com/office/word/2016/wordml/cid" xmlns:w16="http://schemas.microsoft.com/office/word/2018/wordml" xmlns:w16du="http://schemas.microsoft.com/office/word/2023/wordml/word16du" xmlns:w16sdtdh="http://schemas.microsoft.com/office/word/2020/wordml/sdtdatahash" xmlns:w16sdtfl="http://schemas.microsoft.com/office/word/2024/wordml/sdtformatlock" xmlns:w16se="http://schemas.microsoft.com/office/word/2015/wordml/symex" xmlns:wpg="http://schemas.microsoft.com/office/word/2010/wordprocessingGroup" xmlns:wpi="http://schemas.microsoft.com/office/word/2010/wordprocessingInk" xmlns:wne="http://schemas.microsoft.com/office/word/2006/wordml" xmlns:wps="http://schemas.microsoft.com/office/word/2010/wordprocessingShape" mc:Ignorable="w14 w15 w16se w16cid w16 w16cex w16sdtdh w16sdtfl w16du wp14">
   <w:abstractNum w:abstractNumId="0" w15:restartNumberingAfterBreak="0">
     <w:nsid w:val="049156A1"/>
     <w:multiLevelType w:val="hybridMultilevel"/>
@@ -4560,6 +4492,23 @@
     </w:lvl>
   </w:abstractNum>
   <w:abstractNum w:abstractNumId="22" w15:restartNumberingAfterBreak="0">
+    <w:nsid w:val="4A8E7EE9"/>
+    <w:multiLevelType w:val="singleLevel"/>
+    <w:tmpl w:val="2A00AB3E"/>
+    <w:lvl w:ilvl="0">
+      <w:start w:val="1"/>
+      <w:numFmt w:val="bullet"/>
+      <w:lvlText w:val="•"/>
+      <w:lvlJc w:val="left"/>
+      <w:pPr>
+        <w:ind w:left="340" w:hanging="227"/>
+      </w:pPr>
+      <w:rPr>
+        <w:rFonts w:ascii="Arial" w:hAnsi="Arial" w:cs="Arial" w:hint="default"/>
+      </w:rPr>
+    </w:lvl>
+  </w:abstractNum>
+  <w:abstractNum w:abstractNumId="23" w15:restartNumberingAfterBreak="0">
     <w:nsid w:val="4FE12D10"/>
     <w:multiLevelType w:val="hybridMultilevel"/>
     <w:tmpl w:val="1550181C"/>
@@ -4672,7 +4621,7 @@
       </w:rPr>
     </w:lvl>
   </w:abstractNum>
-  <w:abstractNum w:abstractNumId="23" w15:restartNumberingAfterBreak="0">
+  <w:abstractNum w:abstractNumId="24" w15:restartNumberingAfterBreak="0">
     <w:nsid w:val="50C131BC"/>
     <w:multiLevelType w:val="hybridMultilevel"/>
     <w:tmpl w:val="8FDC567E"/>
@@ -4785,7 +4734,7 @@
       </w:rPr>
     </w:lvl>
   </w:abstractNum>
-  <w:abstractNum w:abstractNumId="24" w15:restartNumberingAfterBreak="0">
+  <w:abstractNum w:abstractNumId="25" w15:restartNumberingAfterBreak="0">
     <w:nsid w:val="510E5C01"/>
     <w:multiLevelType w:val="multilevel"/>
     <w:tmpl w:val="BC9C1F48"/>
@@ -4898,7 +4847,7 @@
       </w:rPr>
     </w:lvl>
   </w:abstractNum>
-  <w:abstractNum w:abstractNumId="25" w15:restartNumberingAfterBreak="0">
+  <w:abstractNum w:abstractNumId="26" w15:restartNumberingAfterBreak="0">
     <w:nsid w:val="5C463542"/>
     <w:multiLevelType w:val="multilevel"/>
     <w:tmpl w:val="C3E4949E"/>
@@ -5047,7 +4996,7 @@
       </w:rPr>
     </w:lvl>
   </w:abstractNum>
-  <w:abstractNum w:abstractNumId="26" w15:restartNumberingAfterBreak="0">
+  <w:abstractNum w:abstractNumId="27" w15:restartNumberingAfterBreak="0">
     <w:nsid w:val="64E91BB3"/>
     <w:multiLevelType w:val="multilevel"/>
     <w:tmpl w:val="A672F762"/>
@@ -5196,7 +5145,7 @@
       </w:rPr>
     </w:lvl>
   </w:abstractNum>
-  <w:abstractNum w:abstractNumId="27" w15:restartNumberingAfterBreak="0">
+  <w:abstractNum w:abstractNumId="28" w15:restartNumberingAfterBreak="0">
     <w:nsid w:val="6ADA0051"/>
     <w:multiLevelType w:val="multilevel"/>
     <w:tmpl w:val="C806233A"/>
@@ -5345,7 +5294,7 @@
       </w:rPr>
     </w:lvl>
   </w:abstractNum>
-  <w:abstractNum w:abstractNumId="28" w15:restartNumberingAfterBreak="0">
+  <w:abstractNum w:abstractNumId="29" w15:restartNumberingAfterBreak="0">
     <w:nsid w:val="6BDB0362"/>
     <w:multiLevelType w:val="hybridMultilevel"/>
     <w:tmpl w:val="8106327E"/>
@@ -5434,7 +5383,7 @@
       </w:pPr>
     </w:lvl>
   </w:abstractNum>
-  <w:abstractNum w:abstractNumId="29" w15:restartNumberingAfterBreak="0">
+  <w:abstractNum w:abstractNumId="30" w15:restartNumberingAfterBreak="0">
     <w:nsid w:val="6F3C13F9"/>
     <w:multiLevelType w:val="hybridMultilevel"/>
     <w:tmpl w:val="B40CE148"/>
@@ -5547,7 +5496,7 @@
       </w:rPr>
     </w:lvl>
   </w:abstractNum>
-  <w:abstractNum w:abstractNumId="30" w15:restartNumberingAfterBreak="0">
+  <w:abstractNum w:abstractNumId="31" w15:restartNumberingAfterBreak="0">
     <w:nsid w:val="6F5F64B1"/>
     <w:multiLevelType w:val="hybridMultilevel"/>
     <w:tmpl w:val="999C60C0"/>
@@ -5636,7 +5585,21 @@
       </w:pPr>
     </w:lvl>
   </w:abstractNum>
-  <w:abstractNum w:abstractNumId="31" w15:restartNumberingAfterBreak="0">
+  <w:abstractNum w:abstractNumId="32" w15:restartNumberingAfterBreak="0">
+    <w:nsid w:val="701071C1"/>
+    <w:multiLevelType w:val="singleLevel"/>
+    <w:tmpl w:val="A06A7FC2"/>
+    <w:lvl w:ilvl="0">
+      <w:start w:val="1"/>
+      <w:numFmt w:val="decimal"/>
+      <w:lvlText w:val="%1."/>
+      <w:lvlJc w:val="left"/>
+      <w:pPr>
+        <w:ind w:left="340" w:hanging="284"/>
+      </w:pPr>
+    </w:lvl>
+  </w:abstractNum>
+  <w:abstractNum w:abstractNumId="33" w15:restartNumberingAfterBreak="0">
     <w:nsid w:val="731E1176"/>
     <w:multiLevelType w:val="hybridMultilevel"/>
     <w:tmpl w:val="5846EECC"/>
@@ -5725,7 +5688,7 @@
       </w:pPr>
     </w:lvl>
   </w:abstractNum>
-  <w:abstractNum w:abstractNumId="32" w15:restartNumberingAfterBreak="0">
+  <w:abstractNum w:abstractNumId="34" w15:restartNumberingAfterBreak="0">
     <w:nsid w:val="74565F7A"/>
     <w:multiLevelType w:val="multilevel"/>
     <w:tmpl w:val="36B8B0EE"/>
@@ -5874,7 +5837,7 @@
       </w:rPr>
     </w:lvl>
   </w:abstractNum>
-  <w:abstractNum w:abstractNumId="33" w15:restartNumberingAfterBreak="0">
+  <w:abstractNum w:abstractNumId="35" w15:restartNumberingAfterBreak="0">
     <w:nsid w:val="74F525A0"/>
     <w:multiLevelType w:val="hybridMultilevel"/>
     <w:tmpl w:val="6E2889E8"/>
@@ -5987,7 +5950,7 @@
       </w:rPr>
     </w:lvl>
   </w:abstractNum>
-  <w:abstractNum w:abstractNumId="34" w15:restartNumberingAfterBreak="0">
+  <w:abstractNum w:abstractNumId="36" w15:restartNumberingAfterBreak="0">
     <w:nsid w:val="78261542"/>
     <w:multiLevelType w:val="hybridMultilevel"/>
     <w:tmpl w:val="93C21CAE"/>
@@ -6100,7 +6063,7 @@
       </w:rPr>
     </w:lvl>
   </w:abstractNum>
-  <w:abstractNum w:abstractNumId="35" w15:restartNumberingAfterBreak="0">
+  <w:abstractNum w:abstractNumId="37" w15:restartNumberingAfterBreak="0">
     <w:nsid w:val="7A044B22"/>
     <w:multiLevelType w:val="hybridMultilevel"/>
     <w:tmpl w:val="5D9A3082"/>
@@ -6213,7 +6176,7 @@
       </w:rPr>
     </w:lvl>
   </w:abstractNum>
-  <w:abstractNum w:abstractNumId="36" w15:restartNumberingAfterBreak="0">
+  <w:abstractNum w:abstractNumId="38" w15:restartNumberingAfterBreak="0">
     <w:nsid w:val="7AB36760"/>
     <w:multiLevelType w:val="hybridMultilevel"/>
     <w:tmpl w:val="2A60134C"/>
@@ -6299,7 +6262,7 @@
       </w:pPr>
     </w:lvl>
   </w:abstractNum>
-  <w:abstractNum w:abstractNumId="37" w15:restartNumberingAfterBreak="0">
+  <w:abstractNum w:abstractNumId="39" w15:restartNumberingAfterBreak="0">
     <w:nsid w:val="7B9B44FE"/>
     <w:multiLevelType w:val="multilevel"/>
     <w:tmpl w:val="06565EEA"/>
@@ -6448,7 +6411,7 @@
       </w:rPr>
     </w:lvl>
   </w:abstractNum>
-  <w:abstractNum w:abstractNumId="38" w15:restartNumberingAfterBreak="0">
+  <w:abstractNum w:abstractNumId="40" w15:restartNumberingAfterBreak="0">
     <w:nsid w:val="7DBB548A"/>
     <w:multiLevelType w:val="multilevel"/>
     <w:tmpl w:val="D5CA36FE"/>
@@ -6597,7 +6560,7 @@
       </w:rPr>
     </w:lvl>
   </w:abstractNum>
-  <w:abstractNum w:abstractNumId="39" w15:restartNumberingAfterBreak="0">
+  <w:abstractNum w:abstractNumId="41" w15:restartNumberingAfterBreak="0">
     <w:nsid w:val="7F291C01"/>
     <w:multiLevelType w:val="hybridMultilevel"/>
     <w:tmpl w:val="19B0EB20"/>
@@ -6710,162 +6673,135 @@
       </w:rPr>
     </w:lvl>
   </w:abstractNum>
-  <w:abstractNum w:abstractNumId="40">
-    <w:multiLevelType w:val="singleLevel"/>
-    <w:lvl w:ilvl="0">
-      <w:start w:val="1"/>
-      <w:numFmt w:val="bullet"/>
-      <w:lvlText w:val="•"/>
-      <w:lvlJc w:val="left"/>
-      <w:pPr>
-        <w:ind w:left="340" w:hanging="227"/>
-      </w:pPr>
-      <w:rPr>
-        <w:rFonts w:ascii="Arial" w:hAnsi="Arial" w:cs="Arial" w:hint="default"/>
-      </w:rPr>
-    </w:lvl>
-  </w:abstractNum>
-  <w:abstractNum w:abstractNumId="41">
-    <w:multiLevelType w:val="singleLevel"/>
-    <w:lvl w:ilvl="0">
-      <w:start w:val="1"/>
-      <w:numFmt w:val="decimal"/>
-      <w:lvlText w:val="%1."/>
-      <w:lvlJc w:val="left"/>
-      <w:pPr>
-        <w:ind w:left="340" w:hanging="284"/>
-      </w:pPr>
-    </w:lvl>
-  </w:abstractNum>
-  <w:num w:numId="1">
+  <w:num w:numId="1" w16cid:durableId="1573078599">
     <w:abstractNumId w:val="3"/>
   </w:num>
-  <w:num w:numId="2">
+  <w:num w:numId="2" w16cid:durableId="1870028428">
     <w:abstractNumId w:val="8"/>
   </w:num>
-  <w:num w:numId="3">
+  <w:num w:numId="3" w16cid:durableId="2086997906">
     <w:abstractNumId w:val="12"/>
   </w:num>
-  <w:num w:numId="4">
+  <w:num w:numId="4" w16cid:durableId="2095466555">
+    <w:abstractNumId w:val="29"/>
+  </w:num>
+  <w:num w:numId="5" w16cid:durableId="522521946">
+    <w:abstractNumId w:val="31"/>
+  </w:num>
+  <w:num w:numId="6" w16cid:durableId="921910808">
+    <w:abstractNumId w:val="4"/>
+  </w:num>
+  <w:num w:numId="7" w16cid:durableId="1733427390">
+    <w:abstractNumId w:val="11"/>
+  </w:num>
+  <w:num w:numId="8" w16cid:durableId="1428960636">
+    <w:abstractNumId w:val="19"/>
+  </w:num>
+  <w:num w:numId="9" w16cid:durableId="1620137093">
+    <w:abstractNumId w:val="15"/>
+  </w:num>
+  <w:num w:numId="10" w16cid:durableId="1576208876">
+    <w:abstractNumId w:val="9"/>
+  </w:num>
+  <w:num w:numId="11" w16cid:durableId="426653560">
+    <w:abstractNumId w:val="25"/>
+  </w:num>
+  <w:num w:numId="12" w16cid:durableId="241333422">
+    <w:abstractNumId w:val="37"/>
+  </w:num>
+  <w:num w:numId="13" w16cid:durableId="320889568">
+    <w:abstractNumId w:val="30"/>
+  </w:num>
+  <w:num w:numId="14" w16cid:durableId="1013916978">
+    <w:abstractNumId w:val="1"/>
+  </w:num>
+  <w:num w:numId="15" w16cid:durableId="1769697288">
+    <w:abstractNumId w:val="38"/>
+  </w:num>
+  <w:num w:numId="16" w16cid:durableId="494076058">
+    <w:abstractNumId w:val="21"/>
+  </w:num>
+  <w:num w:numId="17" w16cid:durableId="323822727">
+    <w:abstractNumId w:val="17"/>
+  </w:num>
+  <w:num w:numId="18" w16cid:durableId="1077899203">
+    <w:abstractNumId w:val="33"/>
+  </w:num>
+  <w:num w:numId="19" w16cid:durableId="1386829100">
+    <w:abstractNumId w:val="10"/>
+  </w:num>
+  <w:num w:numId="20" w16cid:durableId="1425107999">
+    <w:abstractNumId w:val="41"/>
+  </w:num>
+  <w:num w:numId="21" w16cid:durableId="299189130">
+    <w:abstractNumId w:val="36"/>
+  </w:num>
+  <w:num w:numId="22" w16cid:durableId="1202594328">
+    <w:abstractNumId w:val="13"/>
+  </w:num>
+  <w:num w:numId="23" w16cid:durableId="1919052629">
+    <w:abstractNumId w:val="14"/>
+  </w:num>
+  <w:num w:numId="24" w16cid:durableId="348531118">
+    <w:abstractNumId w:val="5"/>
+  </w:num>
+  <w:num w:numId="25" w16cid:durableId="1891066162">
+    <w:abstractNumId w:val="16"/>
+  </w:num>
+  <w:num w:numId="26" w16cid:durableId="1315331507">
+    <w:abstractNumId w:val="20"/>
+  </w:num>
+  <w:num w:numId="27" w16cid:durableId="119498692">
+    <w:abstractNumId w:val="24"/>
+  </w:num>
+  <w:num w:numId="28" w16cid:durableId="1864320978">
+    <w:abstractNumId w:val="0"/>
+  </w:num>
+  <w:num w:numId="29" w16cid:durableId="1931968395">
+    <w:abstractNumId w:val="18"/>
+  </w:num>
+  <w:num w:numId="30" w16cid:durableId="73286736">
+    <w:abstractNumId w:val="23"/>
+  </w:num>
+  <w:num w:numId="31" w16cid:durableId="1769931073">
+    <w:abstractNumId w:val="2"/>
+  </w:num>
+  <w:num w:numId="32" w16cid:durableId="327173430">
+    <w:abstractNumId w:val="7"/>
+  </w:num>
+  <w:num w:numId="33" w16cid:durableId="1985625187">
+    <w:abstractNumId w:val="34"/>
+  </w:num>
+  <w:num w:numId="34" w16cid:durableId="1011951421">
+    <w:abstractNumId w:val="40"/>
+  </w:num>
+  <w:num w:numId="35" w16cid:durableId="1305698708">
+    <w:abstractNumId w:val="6"/>
+  </w:num>
+  <w:num w:numId="36" w16cid:durableId="1977565641">
+    <w:abstractNumId w:val="26"/>
+  </w:num>
+  <w:num w:numId="37" w16cid:durableId="1965574585">
+    <w:abstractNumId w:val="39"/>
+  </w:num>
+  <w:num w:numId="38" w16cid:durableId="392972374">
     <w:abstractNumId w:val="28"/>
   </w:num>
-  <w:num w:numId="5">
-    <w:abstractNumId w:val="30"/>
+  <w:num w:numId="39" w16cid:durableId="2038458702">
+    <w:abstractNumId w:val="27"/>
   </w:num>
-  <w:num w:numId="6">
-    <w:abstractNumId w:val="4"/>
-  </w:num>
-  <w:num w:numId="7">
-    <w:abstractNumId w:val="11"/>
-  </w:num>
-  <w:num w:numId="8">
-    <w:abstractNumId w:val="19"/>
-  </w:num>
-  <w:num w:numId="9">
-    <w:abstractNumId w:val="15"/>
-  </w:num>
-  <w:num w:numId="10">
-    <w:abstractNumId w:val="9"/>
-  </w:num>
-  <w:num w:numId="11">
-    <w:abstractNumId w:val="24"/>
-  </w:num>
-  <w:num w:numId="12">
+  <w:num w:numId="40" w16cid:durableId="189732876">
     <w:abstractNumId w:val="35"/>
   </w:num>
-  <w:num w:numId="13">
-    <w:abstractNumId w:val="29"/>
-  </w:num>
-  <w:num w:numId="14">
-    <w:abstractNumId w:val="1"/>
-  </w:num>
-  <w:num w:numId="15">
-    <w:abstractNumId w:val="36"/>
-  </w:num>
-  <w:num w:numId="16">
-    <w:abstractNumId w:val="21"/>
-  </w:num>
-  <w:num w:numId="17">
-    <w:abstractNumId w:val="17"/>
-  </w:num>
-  <w:num w:numId="18">
-    <w:abstractNumId w:val="31"/>
-  </w:num>
-  <w:num w:numId="19">
-    <w:abstractNumId w:val="10"/>
-  </w:num>
-  <w:num w:numId="20">
-    <w:abstractNumId w:val="39"/>
-  </w:num>
-  <w:num w:numId="21">
-    <w:abstractNumId w:val="34"/>
-  </w:num>
-  <w:num w:numId="22">
-    <w:abstractNumId w:val="13"/>
-  </w:num>
-  <w:num w:numId="23">
-    <w:abstractNumId w:val="14"/>
-  </w:num>
-  <w:num w:numId="24">
-    <w:abstractNumId w:val="5"/>
-  </w:num>
-  <w:num w:numId="25">
-    <w:abstractNumId w:val="16"/>
-  </w:num>
-  <w:num w:numId="26">
-    <w:abstractNumId w:val="20"/>
-  </w:num>
-  <w:num w:numId="27">
-    <w:abstractNumId w:val="23"/>
-  </w:num>
-  <w:num w:numId="28">
-    <w:abstractNumId w:val="0"/>
-  </w:num>
-  <w:num w:numId="29">
-    <w:abstractNumId w:val="18"/>
-  </w:num>
-  <w:num w:numId="30">
+  <w:num w:numId="41" w16cid:durableId="1994871942">
     <w:abstractNumId w:val="22"/>
-  </w:num>
-  <w:num w:numId="31">
-    <w:abstractNumId w:val="2"/>
-  </w:num>
-  <w:num w:numId="32">
-    <w:abstractNumId w:val="7"/>
-  </w:num>
-  <w:num w:numId="33">
-    <w:abstractNumId w:val="32"/>
-  </w:num>
-  <w:num w:numId="34">
-    <w:abstractNumId w:val="38"/>
-  </w:num>
-  <w:num w:numId="35">
-    <w:abstractNumId w:val="6"/>
-  </w:num>
-  <w:num w:numId="36">
-    <w:abstractNumId w:val="25"/>
-  </w:num>
-  <w:num w:numId="37">
-    <w:abstractNumId w:val="37"/>
-  </w:num>
-  <w:num w:numId="38">
-    <w:abstractNumId w:val="27"/>
-  </w:num>
-  <w:num w:numId="39">
-    <w:abstractNumId w:val="26"/>
-  </w:num>
-  <w:num w:numId="40">
-    <w:abstractNumId w:val="33"/>
-  </w:num>
-  <w:num w:numId="41">
-    <w:abstractNumId w:val="40"/>
   </w:num>
   <w:numIdMacAtCleanup w:val="18"/>
 </w:numbering>
 </file>
 
 <file path=word/styles.xml><?xml version="1.0" encoding="utf-8"?>
-<w:styles xmlns:mc="http://schemas.openxmlformats.org/markup-compatibility/2006" xmlns:r="http://schemas.openxmlformats.org/officeDocument/2006/relationships" xmlns:w="http://schemas.openxmlformats.org/wordprocessingml/2006/main" xmlns:w14="http://schemas.microsoft.com/office/word/2010/wordml" xmlns:w15="http://schemas.microsoft.com/office/word/2012/wordml" xmlns:w16se="http://schemas.microsoft.com/office/word/2015/wordml/symex" mc:Ignorable="w14 w15 w16se">
+<w:styles xmlns:mc="http://schemas.openxmlformats.org/markup-compatibility/2006" xmlns:r="http://schemas.openxmlformats.org/officeDocument/2006/relationships" xmlns:w="http://schemas.openxmlformats.org/wordprocessingml/2006/main" xmlns:w14="http://schemas.microsoft.com/office/word/2010/wordml" xmlns:w15="http://schemas.microsoft.com/office/word/2012/wordml" xmlns:w16cex="http://schemas.microsoft.com/office/word/2018/wordml/cex" xmlns:w16cid="http://schemas.microsoft.com/office/word/2016/wordml/cid" xmlns:w16="http://schemas.microsoft.com/office/word/2018/wordml" xmlns:w16du="http://schemas.microsoft.com/office/word/2023/wordml/word16du" xmlns:w16sdtdh="http://schemas.microsoft.com/office/word/2020/wordml/sdtdatahash" xmlns:w16sdtfl="http://schemas.microsoft.com/office/word/2024/wordml/sdtformatlock" xmlns:w16se="http://schemas.microsoft.com/office/word/2015/wordml/symex" mc:Ignorable="w14 w15 w16se w16cid w16 w16cex w16sdtdh w16sdtfl w16du">
   <w:docDefaults>
     <w:rPrDefault>
       <w:rPr>
@@ -6881,7 +6817,7 @@
       </w:pPr>
     </w:pPrDefault>
   </w:docDefaults>
-  <w:latentStyles w:defLockedState="0" w:defUIPriority="99" w:defSemiHidden="0" w:defUnhideWhenUsed="0" w:defQFormat="0" w:count="371">
+  <w:latentStyles w:defLockedState="0" w:defUIPriority="99" w:defSemiHidden="0" w:defUnhideWhenUsed="0" w:defQFormat="0" w:count="376">
     <w:lsdException w:name="Normal" w:uiPriority="0" w:qFormat="1"/>
     <w:lsdException w:name="heading 1" w:uiPriority="9" w:qFormat="1"/>
     <w:lsdException w:name="heading 2" w:semiHidden="1" w:uiPriority="9" w:unhideWhenUsed="1" w:qFormat="1"/>
@@ -7253,6 +7189,11 @@
     <w:lsdException w:name="List Table 5 Dark Accent 6" w:uiPriority="50"/>
     <w:lsdException w:name="List Table 6 Colorful Accent 6" w:uiPriority="51"/>
     <w:lsdException w:name="List Table 7 Colorful Accent 6" w:uiPriority="52"/>
+    <w:lsdException w:name="Mention" w:semiHidden="1" w:unhideWhenUsed="1"/>
+    <w:lsdException w:name="Smart Hyperlink" w:semiHidden="1" w:unhideWhenUsed="1"/>
+    <w:lsdException w:name="Hashtag" w:semiHidden="1" w:unhideWhenUsed="1"/>
+    <w:lsdException w:name="Unresolved Mention" w:semiHidden="1" w:unhideWhenUsed="1"/>
+    <w:lsdException w:name="Smart Link" w:semiHidden="1" w:unhideWhenUsed="1"/>
   </w:latentStyles>
   <w:style w:type="paragraph" w:default="1" w:styleId="Normal">
     <w:name w:val="Normal"/>
@@ -7326,7 +7267,6 @@
   <w:style w:type="character" w:default="1" w:styleId="Fuentedeprrafopredeter">
     <w:name w:val="Default Paragraph Font"/>
     <w:uiPriority w:val="1"/>
-    <w:semiHidden/>
     <w:unhideWhenUsed/>
   </w:style>
   <w:style w:type="table" w:default="1" w:styleId="Tablanormal">
@@ -8236,7 +8176,7 @@
       <w:szCs w:val="24"/>
     </w:rPr>
   </w:style>
-  <w:style w:type="table" w:styleId="Cuadrculadetablaclara">
+  <w:style w:type="table" w:styleId="Tablaconcuadrculaclara">
     <w:name w:val="Grid Table Light"/>
     <w:basedOn w:val="Tablanormal"/>
     <w:uiPriority w:val="40"/>
@@ -8258,7 +8198,7 @@
   <w:style w:type="table" w:customStyle="1" w:styleId="Cuadrculadetablaclara1">
     <w:name w:val="Cuadrícula de tabla clara1"/>
     <w:basedOn w:val="Tablanormal"/>
-    <w:next w:val="Cuadrculadetablaclara"/>
+    <w:next w:val="Tablaconcuadrculaclara"/>
     <w:uiPriority w:val="40"/>
     <w:rsid w:val="00943DF1"/>
     <w:pPr>
@@ -8299,7 +8239,7 @@
       <w:spacing w:after="0" w:line="240" w:lineRule="auto"/>
     </w:pPr>
   </w:style>
-  <w:style w:type="character" w:styleId="Textoennegrita">
+  <w:style w:type="character" w:styleId="Fuerte">
     <w:name w:val="Strong"/>
     <w:basedOn w:val="Fuentedeprrafopredeter"/>
     <w:uiPriority w:val="22"/>
@@ -8311,532 +8251,6 @@
     </w:rPr>
   </w:style>
 </w:styles>
-</file>
-
-<file path=word/glossary/document.xml><?xml version="1.0" encoding="utf-8"?>
-<w:glossaryDocument xmlns:wpc="http://schemas.microsoft.com/office/word/2010/wordprocessingCanvas" xmlns:cx="http://schemas.microsoft.com/office/drawing/2014/chartex" xmlns:mc="http://schemas.openxmlformats.org/markup-compatibility/2006" xmlns:o="urn:schemas-microsoft-com:office:office" xmlns:r="http://schemas.openxmlformats.org/officeDocument/2006/relationships" xmlns:m="http://schemas.openxmlformats.org/officeDocument/2006/math" xmlns:v="urn:schemas-microsoft-com:vml" xmlns:wp14="http://schemas.microsoft.com/office/word/2010/wordprocessingDrawing" xmlns:wp="http://schemas.openxmlformats.org/drawingml/2006/wordprocessingDrawing" xmlns:w10="urn:schemas-microsoft-com:office:word" xmlns:w="http://schemas.openxmlformats.org/wordprocessingml/2006/main" xmlns:w14="http://schemas.microsoft.com/office/word/2010/wordml" xmlns:w15="http://schemas.microsoft.com/office/word/2012/wordml" xmlns:w16se="http://schemas.microsoft.com/office/word/2015/wordml/symex" xmlns:wpg="http://schemas.microsoft.com/office/word/2010/wordprocessingGroup" xmlns:wpi="http://schemas.microsoft.com/office/word/2010/wordprocessingInk" xmlns:wne="http://schemas.microsoft.com/office/word/2006/wordml" xmlns:wps="http://schemas.microsoft.com/office/word/2010/wordprocessingShape" mc:Ignorable="w14 w15 w16se wp14"/>
-</file>
-
-<file path=word/glossary/fontTable.xml><?xml version="1.0" encoding="utf-8"?>
-<w:fonts xmlns:mc="http://schemas.openxmlformats.org/markup-compatibility/2006" xmlns:r="http://schemas.openxmlformats.org/officeDocument/2006/relationships" xmlns:w="http://schemas.openxmlformats.org/wordprocessingml/2006/main" xmlns:w14="http://schemas.microsoft.com/office/word/2010/wordml" xmlns:w15="http://schemas.microsoft.com/office/word/2012/wordml" xmlns:w16se="http://schemas.microsoft.com/office/word/2015/wordml/symex" mc:Ignorable="w14 w15 w16se">
-  <w:font w:name="Calibri">
-    <w:panose1 w:val="020F0502020204030204"/>
-    <w:charset w:val="00"/>
-    <w:family w:val="swiss"/>
-    <w:pitch w:val="variable"/>
-    <w:sig w:usb0="E4002EFF" w:usb1="C000247B" w:usb2="00000009" w:usb3="00000000" w:csb0="000001FF" w:csb1="00000000"/>
-  </w:font>
-  <w:font w:name="Times New Roman">
-    <w:panose1 w:val="02020603050405020304"/>
-    <w:charset w:val="00"/>
-    <w:family w:val="roman"/>
-    <w:pitch w:val="variable"/>
-    <w:sig w:usb0="E0002EFF" w:usb1="C000785B" w:usb2="00000009" w:usb3="00000000" w:csb0="000001FF" w:csb1="00000000"/>
-  </w:font>
-  <w:font w:name="Courier New">
-    <w:panose1 w:val="02070309020205020404"/>
-    <w:charset w:val="00"/>
-    <w:family w:val="modern"/>
-    <w:pitch w:val="fixed"/>
-    <w:sig w:usb0="E0002EFF" w:usb1="C0007843" w:usb2="00000009" w:usb3="00000000" w:csb0="000001FF" w:csb1="00000000"/>
-  </w:font>
-  <w:font w:name="Wingdings">
-    <w:panose1 w:val="05000000000000000000"/>
-    <w:charset w:val="02"/>
-    <w:family w:val="auto"/>
-    <w:pitch w:val="variable"/>
-    <w:sig w:usb0="00000000" w:usb1="10000000" w:usb2="00000000" w:usb3="00000000" w:csb0="80000000" w:csb1="00000000"/>
-  </w:font>
-  <w:font w:name="Symbol">
-    <w:panose1 w:val="05050102010706020507"/>
-    <w:charset w:val="02"/>
-    <w:family w:val="roman"/>
-    <w:pitch w:val="variable"/>
-    <w:sig w:usb0="00000000" w:usb1="10000000" w:usb2="00000000" w:usb3="00000000" w:csb0="80000000" w:csb1="00000000"/>
-  </w:font>
-  <w:font w:name="Calibri Light">
-    <w:panose1 w:val="020F0302020204030204"/>
-    <w:charset w:val="00"/>
-    <w:family w:val="swiss"/>
-    <w:pitch w:val="variable"/>
-    <w:sig w:usb0="E4002EFF" w:usb1="C000247B" w:usb2="00000009" w:usb3="00000000" w:csb0="000001FF" w:csb1="00000000"/>
-  </w:font>
-  <w:font w:name="Segoe UI">
-    <w:panose1 w:val="020B0502040204020203"/>
-    <w:charset w:val="00"/>
-    <w:family w:val="swiss"/>
-    <w:pitch w:val="variable"/>
-    <w:sig w:usb0="E4002EFF" w:usb1="C000E47F" w:usb2="00000009" w:usb3="00000000" w:csb0="000001FF" w:csb1="00000000"/>
-  </w:font>
-  <w:font w:name="Century Gothic">
-    <w:panose1 w:val="020B0502020202020204"/>
-    <w:charset w:val="00"/>
-    <w:family w:val="swiss"/>
-    <w:pitch w:val="variable"/>
-    <w:sig w:usb0="00000287" w:usb1="00000000" w:usb2="00000000" w:usb3="00000000" w:csb0="0000009F" w:csb1="00000000"/>
-  </w:font>
-</w:fonts>
-</file>
-
-<file path=word/glossary/settings.xml><?xml version="1.0" encoding="utf-8"?>
-<w:settings xmlns:mc="http://schemas.openxmlformats.org/markup-compatibility/2006" xmlns:o="urn:schemas-microsoft-com:office:office" xmlns:r="http://schemas.openxmlformats.org/officeDocument/2006/relationships" xmlns:m="http://schemas.openxmlformats.org/officeDocument/2006/math" xmlns:v="urn:schemas-microsoft-com:vml" xmlns:w10="urn:schemas-microsoft-com:office:word" xmlns:w="http://schemas.openxmlformats.org/wordprocessingml/2006/main" xmlns:w14="http://schemas.microsoft.com/office/word/2010/wordml" xmlns:w15="http://schemas.microsoft.com/office/word/2012/wordml" xmlns:w16se="http://schemas.microsoft.com/office/word/2015/wordml/symex" xmlns:sl="http://schemas.openxmlformats.org/schemaLibrary/2006/main" mc:Ignorable="w14 w15 w16se">
-  <w:defaultTabStop w:val="708"/>
-  <w:hyphenationZone w:val="425"/>
-  <w:characterSpacingControl w:val="doNotCompress"/>
-  <w:compat>
-    <w:useFELayout/>
-    <w:compatSetting w:name="compatibilityMode" w:uri="http://schemas.microsoft.com/office/word" w:val="12"/>
-  </w:compat>
-  <w:rsids>
-    <w:rsidRoot w:val="008F14D6"/>
-    <w:rsid w:val="008F14D6"/>
-  </w:rsids>
-  <m:mathPr>
-    <m:mathFont m:val="Cambria Math"/>
-    <m:brkBin m:val="before"/>
-    <m:brkBinSub m:val="--"/>
-    <m:smallFrac m:val="0"/>
-    <m:dispDef/>
-    <m:lMargin m:val="0"/>
-    <m:rMargin m:val="0"/>
-    <m:defJc m:val="centerGroup"/>
-    <m:wrapIndent m:val="1440"/>
-    <m:intLim m:val="subSup"/>
-    <m:naryLim m:val="undOvr"/>
-  </m:mathPr>
-  <w:themeFontLang w:val="es-CL"/>
-  <w:clrSchemeMapping w:bg1="light1" w:t1="dark1" w:bg2="light2" w:t2="dark2" w:accent1="accent1" w:accent2="accent2" w:accent3="accent3" w:accent4="accent4" w:accent5="accent5" w:accent6="accent6" w:hyperlink="hyperlink" w:followedHyperlink="followedHyperlink"/>
-  <w:decimalSymbol w:val=","/>
-  <w:listSeparator w:val=";"/>
-</w:settings>
-</file>
-
-<file path=word/glossary/styles.xml><?xml version="1.0" encoding="utf-8"?>
-<w:styles xmlns:mc="http://schemas.openxmlformats.org/markup-compatibility/2006" xmlns:r="http://schemas.openxmlformats.org/officeDocument/2006/relationships" xmlns:w="http://schemas.openxmlformats.org/wordprocessingml/2006/main" xmlns:w14="http://schemas.microsoft.com/office/word/2010/wordml" xmlns:w15="http://schemas.microsoft.com/office/word/2012/wordml" xmlns:w16se="http://schemas.microsoft.com/office/word/2015/wordml/symex" mc:Ignorable="w14 w15 w16se">
-  <w:docDefaults>
-    <w:rPrDefault>
-      <w:rPr>
-        <w:rFonts w:asciiTheme="minorHAnsi" w:eastAsiaTheme="minorEastAsia" w:hAnsiTheme="minorHAnsi" w:cstheme="minorBidi"/>
-        <w:sz w:val="22"/>
-        <w:szCs w:val="22"/>
-        <w:lang w:val="es-CL" w:eastAsia="es-CL" w:bidi="ar-SA"/>
-      </w:rPr>
-    </w:rPrDefault>
-    <w:pPrDefault>
-      <w:pPr>
-        <w:spacing w:after="160" w:line="259" w:lineRule="auto"/>
-      </w:pPr>
-    </w:pPrDefault>
-  </w:docDefaults>
-  <w:latentStyles w:defLockedState="0" w:defUIPriority="99" w:defSemiHidden="0" w:defUnhideWhenUsed="0" w:defQFormat="0" w:count="371">
-    <w:lsdException w:name="Normal" w:uiPriority="0" w:qFormat="1"/>
-    <w:lsdException w:name="heading 1" w:uiPriority="9" w:qFormat="1"/>
-    <w:lsdException w:name="heading 2" w:semiHidden="1" w:uiPriority="9" w:unhideWhenUsed="1" w:qFormat="1"/>
-    <w:lsdException w:name="heading 3" w:semiHidden="1" w:uiPriority="9" w:unhideWhenUsed="1" w:qFormat="1"/>
-    <w:lsdException w:name="heading 4" w:semiHidden="1" w:uiPriority="9" w:unhideWhenUsed="1" w:qFormat="1"/>
-    <w:lsdException w:name="heading 5" w:semiHidden="1" w:uiPriority="9" w:unhideWhenUsed="1" w:qFormat="1"/>
-    <w:lsdException w:name="heading 6" w:semiHidden="1" w:uiPriority="9" w:unhideWhenUsed="1" w:qFormat="1"/>
-    <w:lsdException w:name="heading 7" w:semiHidden="1" w:uiPriority="9" w:unhideWhenUsed="1" w:qFormat="1"/>
-    <w:lsdException w:name="heading 8" w:semiHidden="1" w:uiPriority="9" w:unhideWhenUsed="1" w:qFormat="1"/>
-    <w:lsdException w:name="heading 9" w:semiHidden="1" w:uiPriority="9" w:unhideWhenUsed="1" w:qFormat="1"/>
-    <w:lsdException w:name="index 1" w:semiHidden="1" w:unhideWhenUsed="1"/>
-    <w:lsdException w:name="index 2" w:semiHidden="1" w:unhideWhenUsed="1"/>
-    <w:lsdException w:name="index 3" w:semiHidden="1" w:unhideWhenUsed="1"/>
-    <w:lsdException w:name="index 4" w:semiHidden="1" w:unhideWhenUsed="1"/>
-    <w:lsdException w:name="index 5" w:semiHidden="1" w:unhideWhenUsed="1"/>
-    <w:lsdException w:name="index 6" w:semiHidden="1" w:unhideWhenUsed="1"/>
-    <w:lsdException w:name="index 7" w:semiHidden="1" w:unhideWhenUsed="1"/>
-    <w:lsdException w:name="index 8" w:semiHidden="1" w:unhideWhenUsed="1"/>
-    <w:lsdException w:name="index 9" w:semiHidden="1" w:unhideWhenUsed="1"/>
-    <w:lsdException w:name="toc 1" w:semiHidden="1" w:uiPriority="39" w:unhideWhenUsed="1"/>
-    <w:lsdException w:name="toc 2" w:semiHidden="1" w:uiPriority="39" w:unhideWhenUsed="1"/>
-    <w:lsdException w:name="toc 3" w:semiHidden="1" w:uiPriority="39" w:unhideWhenUsed="1"/>
-    <w:lsdException w:name="toc 4" w:semiHidden="1" w:uiPriority="39" w:unhideWhenUsed="1"/>
-    <w:lsdException w:name="toc 5" w:semiHidden="1" w:uiPriority="39" w:unhideWhenUsed="1"/>
-    <w:lsdException w:name="toc 6" w:semiHidden="1" w:uiPriority="39" w:unhideWhenUsed="1"/>
-    <w:lsdException w:name="toc 7" w:semiHidden="1" w:uiPriority="39" w:unhideWhenUsed="1"/>
-    <w:lsdException w:name="toc 8" w:semiHidden="1" w:uiPriority="39" w:unhideWhenUsed="1"/>
-    <w:lsdException w:name="toc 9" w:semiHidden="1" w:uiPriority="39" w:unhideWhenUsed="1"/>
-    <w:lsdException w:name="Normal Indent" w:semiHidden="1" w:unhideWhenUsed="1"/>
-    <w:lsdException w:name="footnote text" w:semiHidden="1" w:unhideWhenUsed="1"/>
-    <w:lsdException w:name="annotation text" w:semiHidden="1" w:unhideWhenUsed="1"/>
-    <w:lsdException w:name="header" w:semiHidden="1" w:unhideWhenUsed="1"/>
-    <w:lsdException w:name="footer" w:semiHidden="1" w:unhideWhenUsed="1"/>
-    <w:lsdException w:name="index heading" w:semiHidden="1" w:unhideWhenUsed="1"/>
-    <w:lsdException w:name="caption" w:semiHidden="1" w:uiPriority="35" w:unhideWhenUsed="1" w:qFormat="1"/>
-    <w:lsdException w:name="table of figures" w:semiHidden="1" w:unhideWhenUsed="1"/>
-    <w:lsdException w:name="envelope address" w:semiHidden="1" w:unhideWhenUsed="1"/>
-    <w:lsdException w:name="envelope return" w:semiHidden="1" w:unhideWhenUsed="1"/>
-    <w:lsdException w:name="footnote reference" w:semiHidden="1" w:unhideWhenUsed="1"/>
-    <w:lsdException w:name="annotation reference" w:semiHidden="1" w:unhideWhenUsed="1"/>
-    <w:lsdException w:name="line number" w:semiHidden="1" w:unhideWhenUsed="1"/>
-    <w:lsdException w:name="page number" w:semiHidden="1" w:unhideWhenUsed="1"/>
-    <w:lsdException w:name="endnote reference" w:semiHidden="1" w:unhideWhenUsed="1"/>
-    <w:lsdException w:name="endnote text" w:semiHidden="1" w:unhideWhenUsed="1"/>
-    <w:lsdException w:name="table of authorities" w:semiHidden="1" w:unhideWhenUsed="1"/>
-    <w:lsdException w:name="macro" w:semiHidden="1" w:unhideWhenUsed="1"/>
-    <w:lsdException w:name="toa heading" w:semiHidden="1" w:unhideWhenUsed="1"/>
-    <w:lsdException w:name="List" w:semiHidden="1" w:unhideWhenUsed="1"/>
-    <w:lsdException w:name="List Bullet" w:semiHidden="1" w:unhideWhenUsed="1"/>
-    <w:lsdException w:name="List Number" w:semiHidden="1" w:unhideWhenUsed="1"/>
-    <w:lsdException w:name="List 2" w:semiHidden="1" w:unhideWhenUsed="1"/>
-    <w:lsdException w:name="List 3" w:semiHidden="1" w:unhideWhenUsed="1"/>
-    <w:lsdException w:name="List 4" w:semiHidden="1" w:unhideWhenUsed="1"/>
-    <w:lsdException w:name="List 5" w:semiHidden="1" w:unhideWhenUsed="1"/>
-    <w:lsdException w:name="List Bullet 2" w:semiHidden="1" w:unhideWhenUsed="1"/>
-    <w:lsdException w:name="List Bullet 3" w:semiHidden="1" w:unhideWhenUsed="1"/>
-    <w:lsdException w:name="List Bullet 4" w:semiHidden="1" w:unhideWhenUsed="1"/>
-    <w:lsdException w:name="List Bullet 5" w:semiHidden="1" w:unhideWhenUsed="1"/>
-    <w:lsdException w:name="List Number 2" w:semiHidden="1" w:unhideWhenUsed="1"/>
-    <w:lsdException w:name="List Number 3" w:semiHidden="1" w:unhideWhenUsed="1"/>
-    <w:lsdException w:name="List Number 4" w:semiHidden="1" w:unhideWhenUsed="1"/>
-    <w:lsdException w:name="List Number 5" w:semiHidden="1" w:unhideWhenUsed="1"/>
-    <w:lsdException w:name="Title" w:uiPriority="10" w:qFormat="1"/>
-    <w:lsdException w:name="Closing" w:semiHidden="1" w:unhideWhenUsed="1"/>
-    <w:lsdException w:name="Signature" w:semiHidden="1" w:unhideWhenUsed="1"/>
-    <w:lsdException w:name="Default Paragraph Font" w:semiHidden="1" w:uiPriority="1" w:unhideWhenUsed="1"/>
-    <w:lsdException w:name="Body Text" w:semiHidden="1" w:unhideWhenUsed="1"/>
-    <w:lsdException w:name="Body Text Indent" w:semiHidden="1" w:unhideWhenUsed="1"/>
-    <w:lsdException w:name="List Continue" w:semiHidden="1" w:unhideWhenUsed="1"/>
-    <w:lsdException w:name="List Continue 2" w:semiHidden="1" w:unhideWhenUsed="1"/>
-    <w:lsdException w:name="List Continue 3" w:semiHidden="1" w:unhideWhenUsed="1"/>
-    <w:lsdException w:name="List Continue 4" w:semiHidden="1" w:unhideWhenUsed="1"/>
-    <w:lsdException w:name="List Continue 5" w:semiHidden="1" w:unhideWhenUsed="1"/>
-    <w:lsdException w:name="Message Header" w:semiHidden="1" w:unhideWhenUsed="1"/>
-    <w:lsdException w:name="Subtitle" w:uiPriority="11" w:qFormat="1"/>
-    <w:lsdException w:name="Salutation" w:semiHidden="1" w:unhideWhenUsed="1"/>
-    <w:lsdException w:name="Date" w:semiHidden="1" w:unhideWhenUsed="1"/>
-    <w:lsdException w:name="Body Text First Indent" w:semiHidden="1" w:unhideWhenUsed="1"/>
-    <w:lsdException w:name="Body Text First Indent 2" w:semiHidden="1" w:unhideWhenUsed="1"/>
-    <w:lsdException w:name="Note Heading" w:semiHidden="1" w:unhideWhenUsed="1"/>
-    <w:lsdException w:name="Body Text 2" w:semiHidden="1" w:unhideWhenUsed="1"/>
-    <w:lsdException w:name="Body Text 3" w:semiHidden="1" w:unhideWhenUsed="1"/>
-    <w:lsdException w:name="Body Text Indent 2" w:semiHidden="1" w:unhideWhenUsed="1"/>
-    <w:lsdException w:name="Body Text Indent 3" w:semiHidden="1" w:unhideWhenUsed="1"/>
-    <w:lsdException w:name="Block Text" w:semiHidden="1" w:unhideWhenUsed="1"/>
-    <w:lsdException w:name="Hyperlink" w:semiHidden="1" w:unhideWhenUsed="1"/>
-    <w:lsdException w:name="FollowedHyperlink" w:semiHidden="1" w:unhideWhenUsed="1"/>
-    <w:lsdException w:name="Strong" w:uiPriority="22" w:qFormat="1"/>
-    <w:lsdException w:name="Emphasis" w:uiPriority="20" w:qFormat="1"/>
-    <w:lsdException w:name="Document Map" w:semiHidden="1" w:unhideWhenUsed="1"/>
-    <w:lsdException w:name="Plain Text" w:semiHidden="1" w:unhideWhenUsed="1"/>
-    <w:lsdException w:name="E-mail Signature" w:semiHidden="1" w:unhideWhenUsed="1"/>
-    <w:lsdException w:name="HTML Top of Form" w:semiHidden="1" w:unhideWhenUsed="1"/>
-    <w:lsdException w:name="HTML Bottom of Form" w:semiHidden="1" w:unhideWhenUsed="1"/>
-    <w:lsdException w:name="Normal (Web)" w:semiHidden="1" w:unhideWhenUsed="1"/>
-    <w:lsdException w:name="HTML Acronym" w:semiHidden="1" w:unhideWhenUsed="1"/>
-    <w:lsdException w:name="HTML Address" w:semiHidden="1" w:unhideWhenUsed="1"/>
-    <w:lsdException w:name="HTML Cite" w:semiHidden="1" w:unhideWhenUsed="1"/>
-    <w:lsdException w:name="HTML Code" w:semiHidden="1" w:unhideWhenUsed="1"/>
-    <w:lsdException w:name="HTML Definition" w:semiHidden="1" w:unhideWhenUsed="1"/>
-    <w:lsdException w:name="HTML Keyboard" w:semiHidden="1" w:unhideWhenUsed="1"/>
-    <w:lsdException w:name="HTML Preformatted" w:semiHidden="1" w:unhideWhenUsed="1"/>
-    <w:lsdException w:name="HTML Sample" w:semiHidden="1" w:unhideWhenUsed="1"/>
-    <w:lsdException w:name="HTML Typewriter" w:semiHidden="1" w:unhideWhenUsed="1"/>
-    <w:lsdException w:name="HTML Variable" w:semiHidden="1" w:unhideWhenUsed="1"/>
-    <w:lsdException w:name="Normal Table" w:semiHidden="1" w:unhideWhenUsed="1"/>
-    <w:lsdException w:name="annotation subject" w:semiHidden="1" w:unhideWhenUsed="1"/>
-    <w:lsdException w:name="No List" w:semiHidden="1" w:unhideWhenUsed="1"/>
-    <w:lsdException w:name="Outline List 1" w:semiHidden="1" w:unhideWhenUsed="1"/>
-    <w:lsdException w:name="Outline List 2" w:semiHidden="1" w:unhideWhenUsed="1"/>
-    <w:lsdException w:name="Outline List 3" w:semiHidden="1" w:unhideWhenUsed="1"/>
-    <w:lsdException w:name="Table Simple 1" w:semiHidden="1" w:unhideWhenUsed="1"/>
-    <w:lsdException w:name="Table Simple 2" w:semiHidden="1" w:unhideWhenUsed="1"/>
-    <w:lsdException w:name="Table Simple 3" w:semiHidden="1" w:unhideWhenUsed="1"/>
-    <w:lsdException w:name="Table Classic 1" w:semiHidden="1" w:unhideWhenUsed="1"/>
-    <w:lsdException w:name="Table Classic 2" w:semiHidden="1" w:unhideWhenUsed="1"/>
-    <w:lsdException w:name="Table Classic 3" w:semiHidden="1" w:unhideWhenUsed="1"/>
-    <w:lsdException w:name="Table Classic 4" w:semiHidden="1" w:unhideWhenUsed="1"/>
-    <w:lsdException w:name="Table Colorful 1" w:semiHidden="1" w:unhideWhenUsed="1"/>
-    <w:lsdException w:name="Table Colorful 2" w:semiHidden="1" w:unhideWhenUsed="1"/>
-    <w:lsdException w:name="Table Colorful 3" w:semiHidden="1" w:unhideWhenUsed="1"/>
-    <w:lsdException w:name="Table Columns 1" w:semiHidden="1" w:unhideWhenUsed="1"/>
-    <w:lsdException w:name="Table Columns 2" w:semiHidden="1" w:unhideWhenUsed="1"/>
-    <w:lsdException w:name="Table Columns 3" w:semiHidden="1" w:unhideWhenUsed="1"/>
-    <w:lsdException w:name="Table Columns 4" w:semiHidden="1" w:unhideWhenUsed="1"/>
-    <w:lsdException w:name="Table Columns 5" w:semiHidden="1" w:unhideWhenUsed="1"/>
-    <w:lsdException w:name="Table Grid 1" w:semiHidden="1" w:unhideWhenUsed="1"/>
-    <w:lsdException w:name="Table Grid 2" w:semiHidden="1" w:unhideWhenUsed="1"/>
-    <w:lsdException w:name="Table Grid 3" w:semiHidden="1" w:unhideWhenUsed="1"/>
-    <w:lsdException w:name="Table Grid 4" w:semiHidden="1" w:unhideWhenUsed="1"/>
-    <w:lsdException w:name="Table Grid 5" w:semiHidden="1" w:unhideWhenUsed="1"/>
-    <w:lsdException w:name="Table Grid 6" w:semiHidden="1" w:unhideWhenUsed="1"/>
-    <w:lsdException w:name="Table Grid 7" w:semiHidden="1" w:unhideWhenUsed="1"/>
-    <w:lsdException w:name="Table Grid 8" w:semiHidden="1" w:unhideWhenUsed="1"/>
-    <w:lsdException w:name="Table List 1" w:semiHidden="1" w:unhideWhenUsed="1"/>
-    <w:lsdException w:name="Table List 2" w:semiHidden="1" w:unhideWhenUsed="1"/>
-    <w:lsdException w:name="Table List 3" w:semiHidden="1" w:unhideWhenUsed="1"/>
-    <w:lsdException w:name="Table List 4" w:semiHidden="1" w:unhideWhenUsed="1"/>
-    <w:lsdException w:name="Table List 5" w:semiHidden="1" w:unhideWhenUsed="1"/>
-    <w:lsdException w:name="Table List 6" w:semiHidden="1" w:unhideWhenUsed="1"/>
-    <w:lsdException w:name="Table List 7" w:semiHidden="1" w:unhideWhenUsed="1"/>
-    <w:lsdException w:name="Table List 8" w:semiHidden="1" w:unhideWhenUsed="1"/>
-    <w:lsdException w:name="Table 3D effects 1" w:semiHidden="1" w:unhideWhenUsed="1"/>
-    <w:lsdException w:name="Table 3D effects 2" w:semiHidden="1" w:unhideWhenUsed="1"/>
-    <w:lsdException w:name="Table 3D effects 3" w:semiHidden="1" w:unhideWhenUsed="1"/>
-    <w:lsdException w:name="Table Contemporary" w:semiHidden="1" w:unhideWhenUsed="1"/>
-    <w:lsdException w:name="Table Elegant" w:semiHidden="1" w:unhideWhenUsed="1"/>
-    <w:lsdException w:name="Table Professional" w:semiHidden="1" w:unhideWhenUsed="1"/>
-    <w:lsdException w:name="Table Subtle 1" w:semiHidden="1" w:unhideWhenUsed="1"/>
-    <w:lsdException w:name="Table Subtle 2" w:semiHidden="1" w:unhideWhenUsed="1"/>
-    <w:lsdException w:name="Table Web 1" w:semiHidden="1" w:unhideWhenUsed="1"/>
-    <w:lsdException w:name="Table Web 2" w:semiHidden="1" w:unhideWhenUsed="1"/>
-    <w:lsdException w:name="Table Web 3" w:semiHidden="1" w:unhideWhenUsed="1"/>
-    <w:lsdException w:name="Balloon Text" w:semiHidden="1" w:unhideWhenUsed="1"/>
-    <w:lsdException w:name="Table Grid" w:uiPriority="39"/>
-    <w:lsdException w:name="Table Theme" w:semiHidden="1" w:unhideWhenUsed="1"/>
-    <w:lsdException w:name="Placeholder Text" w:semiHidden="1"/>
-    <w:lsdException w:name="No Spacing" w:uiPriority="1" w:qFormat="1"/>
-    <w:lsdException w:name="Light Shading" w:uiPriority="60"/>
-    <w:lsdException w:name="Light List" w:uiPriority="61"/>
-    <w:lsdException w:name="Light Grid" w:uiPriority="62"/>
-    <w:lsdException w:name="Medium Shading 1" w:uiPriority="63"/>
-    <w:lsdException w:name="Medium Shading 2" w:uiPriority="64"/>
-    <w:lsdException w:name="Medium List 1" w:uiPriority="65"/>
-    <w:lsdException w:name="Medium List 2" w:uiPriority="66"/>
-    <w:lsdException w:name="Medium Grid 1" w:uiPriority="67"/>
-    <w:lsdException w:name="Medium Grid 2" w:uiPriority="68"/>
-    <w:lsdException w:name="Medium Grid 3" w:uiPriority="69"/>
-    <w:lsdException w:name="Dark List" w:uiPriority="70"/>
-    <w:lsdException w:name="Colorful Shading" w:uiPriority="71"/>
-    <w:lsdException w:name="Colorful List" w:uiPriority="72"/>
-    <w:lsdException w:name="Colorful Grid" w:uiPriority="73"/>
-    <w:lsdException w:name="Light Shading Accent 1" w:uiPriority="60"/>
-    <w:lsdException w:name="Light List Accent 1" w:uiPriority="61"/>
-    <w:lsdException w:name="Light Grid Accent 1" w:uiPriority="62"/>
-    <w:lsdException w:name="Medium Shading 1 Accent 1" w:uiPriority="63"/>
-    <w:lsdException w:name="Medium Shading 2 Accent 1" w:uiPriority="64"/>
-    <w:lsdException w:name="Medium List 1 Accent 1" w:uiPriority="65"/>
-    <w:lsdException w:name="Revision" w:semiHidden="1"/>
-    <w:lsdException w:name="List Paragraph" w:uiPriority="34" w:qFormat="1"/>
-    <w:lsdException w:name="Quote" w:uiPriority="29" w:qFormat="1"/>
-    <w:lsdException w:name="Intense Quote" w:uiPriority="30" w:qFormat="1"/>
-    <w:lsdException w:name="Medium List 2 Accent 1" w:uiPriority="66"/>
-    <w:lsdException w:name="Medium Grid 1 Accent 1" w:uiPriority="67"/>
-    <w:lsdException w:name="Medium Grid 2 Accent 1" w:uiPriority="68"/>
-    <w:lsdException w:name="Medium Grid 3 Accent 1" w:uiPriority="69"/>
-    <w:lsdException w:name="Dark List Accent 1" w:uiPriority="70"/>
-    <w:lsdException w:name="Colorful Shading Accent 1" w:uiPriority="71"/>
-    <w:lsdException w:name="Colorful List Accent 1" w:uiPriority="72"/>
-    <w:lsdException w:name="Colorful Grid Accent 1" w:uiPriority="73"/>
-    <w:lsdException w:name="Light Shading Accent 2" w:uiPriority="60"/>
-    <w:lsdException w:name="Light List Accent 2" w:uiPriority="61"/>
-    <w:lsdException w:name="Light Grid Accent 2" w:uiPriority="62"/>
-    <w:lsdException w:name="Medium Shading 1 Accent 2" w:uiPriority="63"/>
-    <w:lsdException w:name="Medium Shading 2 Accent 2" w:uiPriority="64"/>
-    <w:lsdException w:name="Medium List 1 Accent 2" w:uiPriority="65"/>
-    <w:lsdException w:name="Medium List 2 Accent 2" w:uiPriority="66"/>
-    <w:lsdException w:name="Medium Grid 1 Accent 2" w:uiPriority="67"/>
-    <w:lsdException w:name="Medium Grid 2 Accent 2" w:uiPriority="68"/>
-    <w:lsdException w:name="Medium Grid 3 Accent 2" w:uiPriority="69"/>
-    <w:lsdException w:name="Dark List Accent 2" w:uiPriority="70"/>
-    <w:lsdException w:name="Colorful Shading Accent 2" w:uiPriority="71"/>
-    <w:lsdException w:name="Colorful List Accent 2" w:uiPriority="72"/>
-    <w:lsdException w:name="Colorful Grid Accent 2" w:uiPriority="73"/>
-    <w:lsdException w:name="Light Shading Accent 3" w:uiPriority="60"/>
-    <w:lsdException w:name="Light List Accent 3" w:uiPriority="61"/>
-    <w:lsdException w:name="Light Grid Accent 3" w:uiPriority="62"/>
-    <w:lsdException w:name="Medium Shading 1 Accent 3" w:uiPriority="63"/>
-    <w:lsdException w:name="Medium Shading 2 Accent 3" w:uiPriority="64"/>
-    <w:lsdException w:name="Medium List 1 Accent 3" w:uiPriority="65"/>
-    <w:lsdException w:name="Medium List 2 Accent 3" w:uiPriority="66"/>
-    <w:lsdException w:name="Medium Grid 1 Accent 3" w:uiPriority="67"/>
-    <w:lsdException w:name="Medium Grid 2 Accent 3" w:uiPriority="68"/>
-    <w:lsdException w:name="Medium Grid 3 Accent 3" w:uiPriority="69"/>
-    <w:lsdException w:name="Dark List Accent 3" w:uiPriority="70"/>
-    <w:lsdException w:name="Colorful Shading Accent 3" w:uiPriority="71"/>
-    <w:lsdException w:name="Colorful List Accent 3" w:uiPriority="72"/>
-    <w:lsdException w:name="Colorful Grid Accent 3" w:uiPriority="73"/>
-    <w:lsdException w:name="Light Shading Accent 4" w:uiPriority="60"/>
-    <w:lsdException w:name="Light List Accent 4" w:uiPriority="61"/>
-    <w:lsdException w:name="Light Grid Accent 4" w:uiPriority="62"/>
-    <w:lsdException w:name="Medium Shading 1 Accent 4" w:uiPriority="63"/>
-    <w:lsdException w:name="Medium Shading 2 Accent 4" w:uiPriority="64"/>
-    <w:lsdException w:name="Medium List 1 Accent 4" w:uiPriority="65"/>
-    <w:lsdException w:name="Medium List 2 Accent 4" w:uiPriority="66"/>
-    <w:lsdException w:name="Medium Grid 1 Accent 4" w:uiPriority="67"/>
-    <w:lsdException w:name="Medium Grid 2 Accent 4" w:uiPriority="68"/>
-    <w:lsdException w:name="Medium Grid 3 Accent 4" w:uiPriority="69"/>
-    <w:lsdException w:name="Dark List Accent 4" w:uiPriority="70"/>
-    <w:lsdException w:name="Colorful Shading Accent 4" w:uiPriority="71"/>
-    <w:lsdException w:name="Colorful List Accent 4" w:uiPriority="72"/>
-    <w:lsdException w:name="Colorful Grid Accent 4" w:uiPriority="73"/>
-    <w:lsdException w:name="Light Shading Accent 5" w:uiPriority="60"/>
-    <w:lsdException w:name="Light List Accent 5" w:uiPriority="61"/>
-    <w:lsdException w:name="Light Grid Accent 5" w:uiPriority="62"/>
-    <w:lsdException w:name="Medium Shading 1 Accent 5" w:uiPriority="63"/>
-    <w:lsdException w:name="Medium Shading 2 Accent 5" w:uiPriority="64"/>
-    <w:lsdException w:name="Medium List 1 Accent 5" w:uiPriority="65"/>
-    <w:lsdException w:name="Medium List 2 Accent 5" w:uiPriority="66"/>
-    <w:lsdException w:name="Medium Grid 1 Accent 5" w:uiPriority="67"/>
-    <w:lsdException w:name="Medium Grid 2 Accent 5" w:uiPriority="68"/>
-    <w:lsdException w:name="Medium Grid 3 Accent 5" w:uiPriority="69"/>
-    <w:lsdException w:name="Dark List Accent 5" w:uiPriority="70"/>
-    <w:lsdException w:name="Colorful Shading Accent 5" w:uiPriority="71"/>
-    <w:lsdException w:name="Colorful List Accent 5" w:uiPriority="72"/>
-    <w:lsdException w:name="Colorful Grid Accent 5" w:uiPriority="73"/>
-    <w:lsdException w:name="Light Shading Accent 6" w:uiPriority="60"/>
-    <w:lsdException w:name="Light List Accent 6" w:uiPriority="61"/>
-    <w:lsdException w:name="Light Grid Accent 6" w:uiPriority="62"/>
-    <w:lsdException w:name="Medium Shading 1 Accent 6" w:uiPriority="63"/>
-    <w:lsdException w:name="Medium Shading 2 Accent 6" w:uiPriority="64"/>
-    <w:lsdException w:name="Medium List 1 Accent 6" w:uiPriority="65"/>
-    <w:lsdException w:name="Medium List 2 Accent 6" w:uiPriority="66"/>
-    <w:lsdException w:name="Medium Grid 1 Accent 6" w:uiPriority="67"/>
-    <w:lsdException w:name="Medium Grid 2 Accent 6" w:uiPriority="68"/>
-    <w:lsdException w:name="Medium Grid 3 Accent 6" w:uiPriority="69"/>
-    <w:lsdException w:name="Dark List Accent 6" w:uiPriority="70"/>
-    <w:lsdException w:name="Colorful Shading Accent 6" w:uiPriority="71"/>
-    <w:lsdException w:name="Colorful List Accent 6" w:uiPriority="72"/>
-    <w:lsdException w:name="Colorful Grid Accent 6" w:uiPriority="73"/>
-    <w:lsdException w:name="Subtle Emphasis" w:uiPriority="19" w:qFormat="1"/>
-    <w:lsdException w:name="Intense Emphasis" w:uiPriority="21" w:qFormat="1"/>
-    <w:lsdException w:name="Subtle Reference" w:uiPriority="31" w:qFormat="1"/>
-    <w:lsdException w:name="Intense Reference" w:uiPriority="32" w:qFormat="1"/>
-    <w:lsdException w:name="Book Title" w:uiPriority="33" w:qFormat="1"/>
-    <w:lsdException w:name="Bibliography" w:semiHidden="1" w:uiPriority="37" w:unhideWhenUsed="1"/>
-    <w:lsdException w:name="TOC Heading" w:semiHidden="1" w:uiPriority="39" w:unhideWhenUsed="1" w:qFormat="1"/>
-    <w:lsdException w:name="Plain Table 1" w:uiPriority="41"/>
-    <w:lsdException w:name="Plain Table 2" w:uiPriority="42"/>
-    <w:lsdException w:name="Plain Table 3" w:uiPriority="43"/>
-    <w:lsdException w:name="Plain Table 4" w:uiPriority="44"/>
-    <w:lsdException w:name="Plain Table 5" w:uiPriority="45"/>
-    <w:lsdException w:name="Grid Table Light" w:uiPriority="40"/>
-    <w:lsdException w:name="Grid Table 1 Light" w:uiPriority="46"/>
-    <w:lsdException w:name="Grid Table 2" w:uiPriority="47"/>
-    <w:lsdException w:name="Grid Table 3" w:uiPriority="48"/>
-    <w:lsdException w:name="Grid Table 4" w:uiPriority="49"/>
-    <w:lsdException w:name="Grid Table 5 Dark" w:uiPriority="50"/>
-    <w:lsdException w:name="Grid Table 6 Colorful" w:uiPriority="51"/>
-    <w:lsdException w:name="Grid Table 7 Colorful" w:uiPriority="52"/>
-    <w:lsdException w:name="Grid Table 1 Light Accent 1" w:uiPriority="46"/>
-    <w:lsdException w:name="Grid Table 2 Accent 1" w:uiPriority="47"/>
-    <w:lsdException w:name="Grid Table 3 Accent 1" w:uiPriority="48"/>
-    <w:lsdException w:name="Grid Table 4 Accent 1" w:uiPriority="49"/>
-    <w:lsdException w:name="Grid Table 5 Dark Accent 1" w:uiPriority="50"/>
-    <w:lsdException w:name="Grid Table 6 Colorful Accent 1" w:uiPriority="51"/>
-    <w:lsdException w:name="Grid Table 7 Colorful Accent 1" w:uiPriority="52"/>
-    <w:lsdException w:name="Grid Table 1 Light Accent 2" w:uiPriority="46"/>
-    <w:lsdException w:name="Grid Table 2 Accent 2" w:uiPriority="47"/>
-    <w:lsdException w:name="Grid Table 3 Accent 2" w:uiPriority="48"/>
-    <w:lsdException w:name="Grid Table 4 Accent 2" w:uiPriority="49"/>
-    <w:lsdException w:name="Grid Table 5 Dark Accent 2" w:uiPriority="50"/>
-    <w:lsdException w:name="Grid Table 6 Colorful Accent 2" w:uiPriority="51"/>
-    <w:lsdException w:name="Grid Table 7 Colorful Accent 2" w:uiPriority="52"/>
-    <w:lsdException w:name="Grid Table 1 Light Accent 3" w:uiPriority="46"/>
-    <w:lsdException w:name="Grid Table 2 Accent 3" w:uiPriority="47"/>
-    <w:lsdException w:name="Grid Table 3 Accent 3" w:uiPriority="48"/>
-    <w:lsdException w:name="Grid Table 4 Accent 3" w:uiPriority="49"/>
-    <w:lsdException w:name="Grid Table 5 Dark Accent 3" w:uiPriority="50"/>
-    <w:lsdException w:name="Grid Table 6 Colorful Accent 3" w:uiPriority="51"/>
-    <w:lsdException w:name="Grid Table 7 Colorful Accent 3" w:uiPriority="52"/>
-    <w:lsdException w:name="Grid Table 1 Light Accent 4" w:uiPriority="46"/>
-    <w:lsdException w:name="Grid Table 2 Accent 4" w:uiPriority="47"/>
-    <w:lsdException w:name="Grid Table 3 Accent 4" w:uiPriority="48"/>
-    <w:lsdException w:name="Grid Table 4 Accent 4" w:uiPriority="49"/>
-    <w:lsdException w:name="Grid Table 5 Dark Accent 4" w:uiPriority="50"/>
-    <w:lsdException w:name="Grid Table 6 Colorful Accent 4" w:uiPriority="51"/>
-    <w:lsdException w:name="Grid Table 7 Colorful Accent 4" w:uiPriority="52"/>
-    <w:lsdException w:name="Grid Table 1 Light Accent 5" w:uiPriority="46"/>
-    <w:lsdException w:name="Grid Table 2 Accent 5" w:uiPriority="47"/>
-    <w:lsdException w:name="Grid Table 3 Accent 5" w:uiPriority="48"/>
-    <w:lsdException w:name="Grid Table 4 Accent 5" w:uiPriority="49"/>
-    <w:lsdException w:name="Grid Table 5 Dark Accent 5" w:uiPriority="50"/>
-    <w:lsdException w:name="Grid Table 6 Colorful Accent 5" w:uiPriority="51"/>
-    <w:lsdException w:name="Grid Table 7 Colorful Accent 5" w:uiPriority="52"/>
-    <w:lsdException w:name="Grid Table 1 Light Accent 6" w:uiPriority="46"/>
-    <w:lsdException w:name="Grid Table 2 Accent 6" w:uiPriority="47"/>
-    <w:lsdException w:name="Grid Table 3 Accent 6" w:uiPriority="48"/>
-    <w:lsdException w:name="Grid Table 4 Accent 6" w:uiPriority="49"/>
-    <w:lsdException w:name="Grid Table 5 Dark Accent 6" w:uiPriority="50"/>
-    <w:lsdException w:name="Grid Table 6 Colorful Accent 6" w:uiPriority="51"/>
-    <w:lsdException w:name="Grid Table 7 Colorful Accent 6" w:uiPriority="52"/>
-    <w:lsdException w:name="List Table 1 Light" w:uiPriority="46"/>
-    <w:lsdException w:name="List Table 2" w:uiPriority="47"/>
-    <w:lsdException w:name="List Table 3" w:uiPriority="48"/>
-    <w:lsdException w:name="List Table 4" w:uiPriority="49"/>
-    <w:lsdException w:name="List Table 5 Dark" w:uiPriority="50"/>
-    <w:lsdException w:name="List Table 6 Colorful" w:uiPriority="51"/>
-    <w:lsdException w:name="List Table 7 Colorful" w:uiPriority="52"/>
-    <w:lsdException w:name="List Table 1 Light Accent 1" w:uiPriority="46"/>
-    <w:lsdException w:name="List Table 2 Accent 1" w:uiPriority="47"/>
-    <w:lsdException w:name="List Table 3 Accent 1" w:uiPriority="48"/>
-    <w:lsdException w:name="List Table 4 Accent 1" w:uiPriority="49"/>
-    <w:lsdException w:name="List Table 5 Dark Accent 1" w:uiPriority="50"/>
-    <w:lsdException w:name="List Table 6 Colorful Accent 1" w:uiPriority="51"/>
-    <w:lsdException w:name="List Table 7 Colorful Accent 1" w:uiPriority="52"/>
-    <w:lsdException w:name="List Table 1 Light Accent 2" w:uiPriority="46"/>
-    <w:lsdException w:name="List Table 2 Accent 2" w:uiPriority="47"/>
-    <w:lsdException w:name="List Table 3 Accent 2" w:uiPriority="48"/>
-    <w:lsdException w:name="List Table 4 Accent 2" w:uiPriority="49"/>
-    <w:lsdException w:name="List Table 5 Dark Accent 2" w:uiPriority="50"/>
-    <w:lsdException w:name="List Table 6 Colorful Accent 2" w:uiPriority="51"/>
-    <w:lsdException w:name="List Table 7 Colorful Accent 2" w:uiPriority="52"/>
-    <w:lsdException w:name="List Table 1 Light Accent 3" w:uiPriority="46"/>
-    <w:lsdException w:name="List Table 2 Accent 3" w:uiPriority="47"/>
-    <w:lsdException w:name="List Table 3 Accent 3" w:uiPriority="48"/>
-    <w:lsdException w:name="List Table 4 Accent 3" w:uiPriority="49"/>
-    <w:lsdException w:name="List Table 5 Dark Accent 3" w:uiPriority="50"/>
-    <w:lsdException w:name="List Table 6 Colorful Accent 3" w:uiPriority="51"/>
-    <w:lsdException w:name="List Table 7 Colorful Accent 3" w:uiPriority="52"/>
-    <w:lsdException w:name="List Table 1 Light Accent 4" w:uiPriority="46"/>
-    <w:lsdException w:name="List Table 2 Accent 4" w:uiPriority="47"/>
-    <w:lsdException w:name="List Table 3 Accent 4" w:uiPriority="48"/>
-    <w:lsdException w:name="List Table 4 Accent 4" w:uiPriority="49"/>
-    <w:lsdException w:name="List Table 5 Dark Accent 4" w:uiPriority="50"/>
-    <w:lsdException w:name="List Table 6 Colorful Accent 4" w:uiPriority="51"/>
-    <w:lsdException w:name="List Table 7 Colorful Accent 4" w:uiPriority="52"/>
-    <w:lsdException w:name="List Table 1 Light Accent 5" w:uiPriority="46"/>
-    <w:lsdException w:name="List Table 2 Accent 5" w:uiPriority="47"/>
-    <w:lsdException w:name="List Table 3 Accent 5" w:uiPriority="48"/>
-    <w:lsdException w:name="List Table 4 Accent 5" w:uiPriority="49"/>
-    <w:lsdException w:name="List Table 5 Dark Accent 5" w:uiPriority="50"/>
-    <w:lsdException w:name="List Table 6 Colorful Accent 5" w:uiPriority="51"/>
-    <w:lsdException w:name="List Table 7 Colorful Accent 5" w:uiPriority="52"/>
-    <w:lsdException w:name="List Table 1 Light Accent 6" w:uiPriority="46"/>
-    <w:lsdException w:name="List Table 2 Accent 6" w:uiPriority="47"/>
-    <w:lsdException w:name="List Table 3 Accent 6" w:uiPriority="48"/>
-    <w:lsdException w:name="List Table 4 Accent 6" w:uiPriority="49"/>
-    <w:lsdException w:name="List Table 5 Dark Accent 6" w:uiPriority="50"/>
-    <w:lsdException w:name="List Table 6 Colorful Accent 6" w:uiPriority="51"/>
-    <w:lsdException w:name="List Table 7 Colorful Accent 6" w:uiPriority="52"/>
-  </w:latentStyles>
-  <w:style w:type="paragraph" w:default="1" w:styleId="Normal">
-    <w:name w:val="Normal"/>
-    <w:qFormat/>
-  </w:style>
-  <w:style w:type="character" w:default="1" w:styleId="Fuentedeprrafopredeter">
-    <w:name w:val="Default Paragraph Font"/>
-    <w:uiPriority w:val="1"/>
-    <w:semiHidden/>
-    <w:unhideWhenUsed/>
-  </w:style>
-  <w:style w:type="table" w:default="1" w:styleId="Tablanormal">
-    <w:name w:val="Normal Table"/>
-    <w:uiPriority w:val="99"/>
-    <w:semiHidden/>
-    <w:unhideWhenUsed/>
-    <w:tblPr>
-      <w:tblInd w:w="0" w:type="dxa"/>
-      <w:tblCellMar>
-        <w:top w:w="0" w:type="dxa"/>
-        <w:left w:w="108" w:type="dxa"/>
-        <w:bottom w:w="0" w:type="dxa"/>
-        <w:right w:w="108" w:type="dxa"/>
-      </w:tblCellMar>
-    </w:tblPr>
-  </w:style>
-  <w:style w:type="numbering" w:default="1" w:styleId="Sinlista">
-    <w:name w:val="No List"/>
-    <w:uiPriority w:val="99"/>
-    <w:semiHidden/>
-    <w:unhideWhenUsed/>
-  </w:style>
-</w:styles>
-</file>
-
-<file path=word/glossary/webSettings.xml><?xml version="1.0" encoding="utf-8"?>
-<w:webSettings xmlns:mc="http://schemas.openxmlformats.org/markup-compatibility/2006" xmlns:r="http://schemas.openxmlformats.org/officeDocument/2006/relationships" xmlns:w="http://schemas.openxmlformats.org/wordprocessingml/2006/main" xmlns:w14="http://schemas.microsoft.com/office/word/2010/wordml" xmlns:w15="http://schemas.microsoft.com/office/word/2012/wordml" xmlns:w16se="http://schemas.microsoft.com/office/word/2015/wordml/symex" mc:Ignorable="w14 w15 w16se"/>
 </file>
 
 <file path=word/theme/theme1.xml><?xml version="1.0" encoding="utf-8"?>
@@ -9101,6 +8515,25 @@
 </file>
 
 <file path=customXml/item1.xml><?xml version="1.0" encoding="utf-8"?>
+<b:Sources xmlns:b="http://schemas.openxmlformats.org/officeDocument/2006/bibliography" xmlns="http://schemas.openxmlformats.org/officeDocument/2006/bibliography" SelectedStyle="\APASixthEditionOfficeOnline.xsl" StyleName="APA" Version="6"/>
+</file>
+
+<file path=customXml/item2.xml><?xml version="1.0" encoding="utf-8"?>
+<?mso-contentType ?>
+<FormTemplates xmlns="http://schemas.microsoft.com/sharepoint/v3/contenttype/forms">
+  <Display>DocumentLibraryForm</Display>
+  <Edit>DocumentLibraryForm</Edit>
+  <New>DocumentLibraryForm</New>
+</FormTemplates>
+</file>
+
+<file path=customXml/item3.xml><?xml version="1.0" encoding="utf-8"?>
+<p:properties xmlns:p="http://schemas.microsoft.com/office/2006/metadata/properties" xmlns:xsi="http://www.w3.org/2001/XMLSchema-instance" xmlns:pc="http://schemas.microsoft.com/office/infopath/2007/PartnerControls">
+  <documentManagement/>
+</p:properties>
+</file>
+
+<file path=customXml/item4.xml><?xml version="1.0" encoding="utf-8"?>
 <ct:contentTypeSchema xmlns:ct="http://schemas.microsoft.com/office/2006/metadata/contentType" xmlns:ma="http://schemas.microsoft.com/office/2006/metadata/properties/metaAttributes" ct:_="" ma:_="" ma:contentTypeName="Documento" ma:contentTypeID="0x010100E96778489EE7714D8BD12CC105EB918B" ma:contentTypeVersion="2" ma:contentTypeDescription="Crear nuevo documento." ma:contentTypeScope="" ma:versionID="416c5c7ae9b5d54d83875cd3c65194e3">
   <xsd:schema xmlns:xsd="http://www.w3.org/2001/XMLSchema" xmlns:xs="http://www.w3.org/2001/XMLSchema" xmlns:p="http://schemas.microsoft.com/office/2006/metadata/properties" xmlns:ns2="126e8a1c-9ea9-435a-ac89-d06c80d62e30" targetNamespace="http://schemas.microsoft.com/office/2006/metadata/properties" ma:root="true" ma:fieldsID="70a237c842677bd850644f8595079f5e" ns2:_="">
     <xsd:import namespace="126e8a1c-9ea9-435a-ac89-d06c80d62e30"/>
@@ -9232,26 +8665,32 @@
 </ct:contentTypeSchema>
 </file>
 
-<file path=customXml/item2.xml><?xml version="1.0" encoding="utf-8"?>
-<p:properties xmlns:p="http://schemas.microsoft.com/office/2006/metadata/properties" xmlns:xsi="http://www.w3.org/2001/XMLSchema-instance" xmlns:pc="http://schemas.microsoft.com/office/infopath/2007/PartnerControls">
-  <documentManagement/>
-</p:properties>
+<file path=customXml/itemProps1.xml><?xml version="1.0" encoding="utf-8"?>
+<ds:datastoreItem xmlns:ds="http://schemas.openxmlformats.org/officeDocument/2006/customXml" ds:itemID="{FBD61725-A60E-40F3-AB5D-0E7F797DD77D}">
+  <ds:schemaRefs>
+    <ds:schemaRef ds:uri="http://schemas.openxmlformats.org/officeDocument/2006/bibliography"/>
+  </ds:schemaRefs>
+</ds:datastoreItem>
 </file>
 
-<file path=customXml/item3.xml><?xml version="1.0" encoding="utf-8"?>
-<?mso-contentType ?>
-<FormTemplates xmlns="http://schemas.microsoft.com/sharepoint/v3/contenttype/forms">
-  <Display>DocumentLibraryForm</Display>
-  <Edit>DocumentLibraryForm</Edit>
-  <New>DocumentLibraryForm</New>
-</FormTemplates>
+<file path=customXml/itemProps2.xml><?xml version="1.0" encoding="utf-8"?>
+<ds:datastoreItem xmlns:ds="http://schemas.openxmlformats.org/officeDocument/2006/customXml" ds:itemID="{DABAA964-10BA-4DBC-ABF2-CDEAC0FAF7AA}">
+  <ds:schemaRefs>
+    <ds:schemaRef ds:uri="http://schemas.microsoft.com/sharepoint/v3/contenttype/forms"/>
+  </ds:schemaRefs>
+</ds:datastoreItem>
 </file>
 
-<file path=customXml/item4.xml><?xml version="1.0" encoding="utf-8"?>
-<b:Sources xmlns:b="http://schemas.openxmlformats.org/officeDocument/2006/bibliography" xmlns="http://schemas.openxmlformats.org/officeDocument/2006/bibliography" SelectedStyle="\APASixthEditionOfficeOnline.xsl" StyleName="APA" Version="6"/>
+<file path=customXml/itemProps3.xml><?xml version="1.0" encoding="utf-8"?>
+<ds:datastoreItem xmlns:ds="http://schemas.openxmlformats.org/officeDocument/2006/customXml" ds:itemID="{5F1783E3-BA1C-4CA3-8E32-C9B378BBED03}">
+  <ds:schemaRefs>
+    <ds:schemaRef ds:uri="http://schemas.microsoft.com/office/2006/metadata/properties"/>
+    <ds:schemaRef ds:uri="http://schemas.microsoft.com/office/infopath/2007/PartnerControls"/>
+  </ds:schemaRefs>
+</ds:datastoreItem>
 </file>
 
-<file path=customXml/itemProps1.xml><?xml version="1.0" encoding="utf-8"?>
+<file path=customXml/itemProps4.xml><?xml version="1.0" encoding="utf-8"?>
 <ds:datastoreItem xmlns:ds="http://schemas.openxmlformats.org/officeDocument/2006/customXml" ds:itemID="{DF0582E6-0C2C-40A6-8E3D-E410E41021C1}">
   <ds:schemaRefs>
     <ds:schemaRef ds:uri="http://schemas.microsoft.com/office/2006/metadata/contentType"/>
@@ -9269,34 +8708,8 @@
 </ds:datastoreItem>
 </file>
 
-<file path=customXml/itemProps2.xml><?xml version="1.0" encoding="utf-8"?>
-<ds:datastoreItem xmlns:ds="http://schemas.openxmlformats.org/officeDocument/2006/customXml" ds:itemID="{5F1783E3-BA1C-4CA3-8E32-C9B378BBED03}">
-  <ds:schemaRefs>
-    <ds:schemaRef ds:uri="http://schemas.openxmlformats.org/package/2006/metadata/core-properties"/>
-    <ds:schemaRef ds:uri="http://schemas.microsoft.com/office/infopath/2007/PartnerControls"/>
-    <ds:schemaRef ds:uri="http://purl.org/dc/elements/1.1/"/>
-    <ds:schemaRef ds:uri="http://schemas.microsoft.com/office/2006/documentManagement/types"/>
-    <ds:schemaRef ds:uri="http://schemas.microsoft.com/office/2006/metadata/properties"/>
-    <ds:schemaRef ds:uri="126e8a1c-9ea9-435a-ac89-d06c80d62e30"/>
-    <ds:schemaRef ds:uri="http://purl.org/dc/terms/"/>
-    <ds:schemaRef ds:uri="http://purl.org/dc/dcmitype/"/>
-    <ds:schemaRef ds:uri="http://www.w3.org/XML/1998/namespace"/>
-  </ds:schemaRefs>
-</ds:datastoreItem>
-</file>
-
-<file path=customXml/itemProps3.xml><?xml version="1.0" encoding="utf-8"?>
-<ds:datastoreItem xmlns:ds="http://schemas.openxmlformats.org/officeDocument/2006/customXml" ds:itemID="{DABAA964-10BA-4DBC-ABF2-CDEAC0FAF7AA}">
-  <ds:schemaRefs>
-    <ds:schemaRef ds:uri="http://schemas.microsoft.com/sharepoint/v3/contenttype/forms"/>
-  </ds:schemaRefs>
-</ds:datastoreItem>
-</file>
-
-<file path=customXml/itemProps4.xml><?xml version="1.0" encoding="utf-8"?>
-<ds:datastoreItem xmlns:ds="http://schemas.openxmlformats.org/officeDocument/2006/customXml" ds:itemID="{FBD61725-A60E-40F3-AB5D-0E7F797DD77D}">
-  <ds:schemaRefs>
-    <ds:schemaRef ds:uri="http://schemas.openxmlformats.org/officeDocument/2006/bibliography"/>
-  </ds:schemaRefs>
-</ds:datastoreItem>
+<file path=docMetadata/LabelInfo.xml><?xml version="1.0" encoding="utf-8"?>
+<clbl:labelList xmlns:clbl="http://schemas.microsoft.com/office/2020/mipLabelMetadata">
+  <clbl:label id="{4b5d952d-de91-44ce-bfde-6fe078e48a2e}" enabled="1" method="Standard" siteId="{c482e453-bf10-4df8-ab51-0445fad2072b}" contentBits="0" removed="0"/>
+</clbl:labelList>
 </file>
</xml_diff>